<commit_message>
docs: incorporate federated operating model (domains own/propose; CDA signs off)
- operating-model/FEDERATED-OPERATING-MODEL.md: full proposal (principles, roles,
  ownership, scope-aware routing matrix, two-tier lifecycle, standards-as-code,
  technical infra, adoption path)
- requirements: new FR-FG (07) federated-governance requirements; CDA/ARB roles
  added to FR-AX; README + traceability updated
- platform/03 governance: federated operating-model section (two-tier + routing + CDA)
- project plan: federation as a priority workstream (§3a), P3/P4 updated, risks
- delivery: epic DCT-EP11 (+9 stories); backlog now 11 epics / 66 stories / 347 pts
- regenerated SRS .docx (incl. FR-FG)

Co-Authored-By: Claude Opus 4.8 <noreply@anthropic.com>
</commit_message>
<xml_diff>
--- a/docs/requirements/DEAL-Control-Tower-SRS.docx
+++ b/docs/requirements/DEAL-Control-Tower-SRS.docx
@@ -9821,36 +9821,64 @@
               <w:rPr>
                 <w:color w:val="0D1B2A"/>
               </w:rPr>
-              <w:t xml:space="preserve"> with roles (viewer, modeler, steward, domain_owner, platform_engineer, governance, admin) mapped from IdP groups.</w:t>
-            </w:r>
-          </w:p>
-        </w:tc>
-        <w:tc>
-          <w:tcPr>
-            <w:tcW w:type="auto" w:w="100"/>
-            <w:tcBorders>
-              <w:top w:val="single" w:color="D9D5CD" w:sz="2"/>
-              <w:left w:val="single" w:color="D9D5CD" w:sz="2"/>
-              <w:bottom w:val="single" w:color="D9D5CD" w:sz="2"/>
-              <w:right w:val="single" w:color="D9D5CD" w:sz="2"/>
-            </w:tcBorders>
-            <w:shd w:color="F1EFE9" w:val="solid"/>
-            <w:tcMar>
-              <w:top w:type="dxa" w:w="60"/>
-              <w:left w:type="dxa" w:w="90"/>
-              <w:bottom w:type="dxa" w:w="60"/>
-              <w:right w:type="dxa" w:w="90"/>
-            </w:tcMar>
-          </w:tcPr>
-          <w:p>
-            <w:pPr>
-              <w:spacing w:after="0"/>
-            </w:pPr>
-            <w:r>
-              <w:rPr>
-                <w:color w:val="0D1B2A"/>
-              </w:rPr>
-              <w:t xml:space="preserve">Each role grants only its capabilities; group→role mapping is configurable.</w:t>
+              <w:t xml:space="preserve"> with roles (viewer, modeler, steward, domain_owner, platform_engineer, governance, </w:t>
+            </w:r>
+            <w:r>
+              <w:rPr>
+                <w:b/>
+                <w:bCs/>
+                <w:color w:val="0D1B2A"/>
+              </w:rPr>
+              <w:t xml:space="preserve">chief_data_architect</w:t>
+            </w:r>
+            <w:r>
+              <w:rPr>
+                <w:color w:val="0D1B2A"/>
+              </w:rPr>
+              <w:t xml:space="preserve">, </w:t>
+            </w:r>
+            <w:r>
+              <w:rPr>
+                <w:b/>
+                <w:bCs/>
+                <w:color w:val="0D1B2A"/>
+              </w:rPr>
+              <w:t xml:space="preserve">architecture_review_board</w:t>
+            </w:r>
+            <w:r>
+              <w:rPr>
+                <w:color w:val="0D1B2A"/>
+              </w:rPr>
+              <w:t xml:space="preserve">, admin) mapped from IdP groups.</w:t>
+            </w:r>
+          </w:p>
+        </w:tc>
+        <w:tc>
+          <w:tcPr>
+            <w:tcW w:type="auto" w:w="100"/>
+            <w:tcBorders>
+              <w:top w:val="single" w:color="D9D5CD" w:sz="2"/>
+              <w:left w:val="single" w:color="D9D5CD" w:sz="2"/>
+              <w:bottom w:val="single" w:color="D9D5CD" w:sz="2"/>
+              <w:right w:val="single" w:color="D9D5CD" w:sz="2"/>
+            </w:tcBorders>
+            <w:shd w:color="F1EFE9" w:val="solid"/>
+            <w:tcMar>
+              <w:top w:type="dxa" w:w="60"/>
+              <w:left w:type="dxa" w:w="90"/>
+              <w:bottom w:type="dxa" w:w="60"/>
+              <w:right w:type="dxa" w:w="90"/>
+            </w:tcMar>
+          </w:tcPr>
+          <w:p>
+            <w:pPr>
+              <w:spacing w:after="0"/>
+            </w:pPr>
+            <w:r>
+              <w:rPr>
+                <w:color w:val="0D1B2A"/>
+              </w:rPr>
+              <w:t xml:space="preserve">Each role grants only its capabilities; group→role mapping is configurable; the CDA role holds enterprise sign-off authority (see FR-FG).</w:t>
             </w:r>
           </w:p>
         </w:tc>
@@ -26925,6 +26953,3904 @@
           <w:bCs/>
           <w:color w:val="0D1B2A"/>
         </w:rPr>
+        <w:t xml:space="preserve">7. Federated Operating Model Requirements (FR-FG)</w:t>
+      </w:r>
+    </w:p>
+    <w:p>
+      <w:pPr>
+        <w:spacing w:after="80"/>
+      </w:pPr>
+      <w:r>
+        <w:t xml:space="preserve">Requirements for the </w:t>
+      </w:r>
+      <w:r>
+        <w:rPr>
+          <w:b/>
+          <w:bCs/>
+        </w:rPr>
+        <w:t xml:space="preserve">federated governance</w:t>
+      </w:r>
+      <w:r>
+        <w:t xml:space="preserve"> of BDM/PDM creation and change:</w:t>
+      </w:r>
+    </w:p>
+    <w:p>
+      <w:pPr>
+        <w:spacing w:after="80"/>
+      </w:pPr>
+      <w:r>
+        <w:t xml:space="preserve">domains own and propose; the </w:t>
+      </w:r>
+      <w:r>
+        <w:rPr>
+          <w:b/>
+          <w:bCs/>
+        </w:rPr>
+        <w:t xml:space="preserve">Chief Data Architect (CDA)</w:t>
+      </w:r>
+      <w:r>
+        <w:t xml:space="preserve"> signs off on</w:t>
+      </w:r>
+    </w:p>
+    <w:p>
+      <w:pPr>
+        <w:spacing w:after="80"/>
+      </w:pPr>
+      <w:r>
+        <w:t xml:space="preserve">enterprise-significant change. Companion to the operating-model proposal</w:t>
+      </w:r>
+    </w:p>
+    <w:p>
+      <w:pPr>
+        <w:spacing w:after="80"/>
+      </w:pPr>
+      <w:r>
+        <w:t xml:space="preserve">([</w:t>
+      </w:r>
+      <w:r>
+        <w:rPr>
+          <w:rFonts w:ascii="Consolas" w:cs="Consolas" w:eastAsia="Consolas" w:hAnsi="Consolas"/>
+        </w:rPr>
+        <w:t xml:space="preserve">../operating-model/FEDERATED-OPERATING-MODEL.md</w:t>
+      </w:r>
+      <w:r>
+        <w:t xml:space="preserve">](../operating-model/FEDERATED-OPERATING-MODEL.md)).</w:t>
+      </w:r>
+    </w:p>
+    <w:p>
+      <w:pPr>
+        <w:spacing w:after="80"/>
+      </w:pPr>
+      <w:r>
+        <w:t xml:space="preserve">Priority: </w:t>
+      </w:r>
+      <w:r>
+        <w:rPr>
+          <w:b/>
+          <w:bCs/>
+        </w:rPr>
+        <w:t xml:space="preserve">M</w:t>
+      </w:r>
+      <w:r>
+        <w:t xml:space="preserve">ust / </w:t>
+      </w:r>
+      <w:r>
+        <w:rPr>
+          <w:b/>
+          <w:bCs/>
+        </w:rPr>
+        <w:t xml:space="preserve">S</w:t>
+      </w:r>
+      <w:r>
+        <w:t xml:space="preserve">hould / </w:t>
+      </w:r>
+      <w:r>
+        <w:rPr>
+          <w:b/>
+          <w:bCs/>
+        </w:rPr>
+        <w:t xml:space="preserve">C</w:t>
+      </w:r>
+      <w:r>
+        <w:t xml:space="preserve">ould.</w:t>
+      </w:r>
+    </w:p>
+    <w:p>
+      <w:pPr>
+        <w:pStyle w:val="Heading2"/>
+        <w:spacing w:after="80" w:before="220"/>
+      </w:pPr>
+      <w:r>
+        <w:rPr>
+          <w:b/>
+          <w:bCs/>
+          <w:color w:val="15756B"/>
+        </w:rPr>
+        <w:t xml:space="preserve">7.1 Domains &amp; ownership</w:t>
+      </w:r>
+    </w:p>
+    <w:tbl>
+      <w:tblPr>
+        <w:tblW w:type="pct" w:w="100%"/>
+        <w:tblBorders>
+          <w:top w:val="single" w:color="D9D5CD" w:sz="2"/>
+          <w:left w:val="single" w:color="D9D5CD" w:sz="2"/>
+          <w:bottom w:val="single" w:color="D9D5CD" w:sz="2"/>
+          <w:right w:val="single" w:color="D9D5CD" w:sz="2"/>
+          <w:insideH w:val="single" w:color="auto" w:sz="4"/>
+          <w:insideV w:val="single" w:color="auto" w:sz="4"/>
+        </w:tblBorders>
+      </w:tblPr>
+      <w:tblGrid>
+        <w:gridCol w:w="100"/>
+        <w:gridCol w:w="100"/>
+        <w:gridCol w:w="100"/>
+        <w:gridCol w:w="100"/>
+      </w:tblGrid>
+      <w:tr>
+        <w:trPr>
+          <w:tblHeader/>
+        </w:trPr>
+        <w:tc>
+          <w:tcPr>
+            <w:tcW w:type="auto" w:w="100"/>
+            <w:tcBorders>
+              <w:top w:val="single" w:color="D9D5CD" w:sz="2"/>
+              <w:left w:val="single" w:color="D9D5CD" w:sz="2"/>
+              <w:bottom w:val="single" w:color="D9D5CD" w:sz="2"/>
+              <w:right w:val="single" w:color="D9D5CD" w:sz="2"/>
+            </w:tcBorders>
+            <w:shd w:color="0D1B2A" w:val="solid"/>
+            <w:tcMar>
+              <w:top w:type="dxa" w:w="60"/>
+              <w:left w:type="dxa" w:w="90"/>
+              <w:bottom w:type="dxa" w:w="60"/>
+              <w:right w:type="dxa" w:w="90"/>
+            </w:tcMar>
+          </w:tcPr>
+          <w:p>
+            <w:pPr>
+              <w:spacing w:after="0"/>
+            </w:pPr>
+            <w:r>
+              <w:rPr>
+                <w:b/>
+                <w:bCs/>
+                <w:color w:val="FFFFFF"/>
+              </w:rPr>
+              <w:t xml:space="preserve">ID</w:t>
+            </w:r>
+          </w:p>
+        </w:tc>
+        <w:tc>
+          <w:tcPr>
+            <w:tcW w:type="auto" w:w="100"/>
+            <w:tcBorders>
+              <w:top w:val="single" w:color="D9D5CD" w:sz="2"/>
+              <w:left w:val="single" w:color="D9D5CD" w:sz="2"/>
+              <w:bottom w:val="single" w:color="D9D5CD" w:sz="2"/>
+              <w:right w:val="single" w:color="D9D5CD" w:sz="2"/>
+            </w:tcBorders>
+            <w:shd w:color="0D1B2A" w:val="solid"/>
+            <w:tcMar>
+              <w:top w:type="dxa" w:w="60"/>
+              <w:left w:type="dxa" w:w="90"/>
+              <w:bottom w:type="dxa" w:w="60"/>
+              <w:right w:type="dxa" w:w="90"/>
+            </w:tcMar>
+          </w:tcPr>
+          <w:p>
+            <w:pPr>
+              <w:spacing w:after="0"/>
+            </w:pPr>
+            <w:r>
+              <w:rPr>
+                <w:b/>
+                <w:bCs/>
+                <w:color w:val="FFFFFF"/>
+              </w:rPr>
+              <w:t xml:space="preserve">Pri</w:t>
+            </w:r>
+          </w:p>
+        </w:tc>
+        <w:tc>
+          <w:tcPr>
+            <w:tcW w:type="auto" w:w="100"/>
+            <w:tcBorders>
+              <w:top w:val="single" w:color="D9D5CD" w:sz="2"/>
+              <w:left w:val="single" w:color="D9D5CD" w:sz="2"/>
+              <w:bottom w:val="single" w:color="D9D5CD" w:sz="2"/>
+              <w:right w:val="single" w:color="D9D5CD" w:sz="2"/>
+            </w:tcBorders>
+            <w:shd w:color="0D1B2A" w:val="solid"/>
+            <w:tcMar>
+              <w:top w:type="dxa" w:w="60"/>
+              <w:left w:type="dxa" w:w="90"/>
+              <w:bottom w:type="dxa" w:w="60"/>
+              <w:right w:type="dxa" w:w="90"/>
+            </w:tcMar>
+          </w:tcPr>
+          <w:p>
+            <w:pPr>
+              <w:spacing w:after="0"/>
+            </w:pPr>
+            <w:r>
+              <w:rPr>
+                <w:b/>
+                <w:bCs/>
+                <w:color w:val="FFFFFF"/>
+              </w:rPr>
+              <w:t xml:space="preserve">Requirement</w:t>
+            </w:r>
+          </w:p>
+        </w:tc>
+        <w:tc>
+          <w:tcPr>
+            <w:tcW w:type="auto" w:w="100"/>
+            <w:tcBorders>
+              <w:top w:val="single" w:color="D9D5CD" w:sz="2"/>
+              <w:left w:val="single" w:color="D9D5CD" w:sz="2"/>
+              <w:bottom w:val="single" w:color="D9D5CD" w:sz="2"/>
+              <w:right w:val="single" w:color="D9D5CD" w:sz="2"/>
+            </w:tcBorders>
+            <w:shd w:color="0D1B2A" w:val="solid"/>
+            <w:tcMar>
+              <w:top w:type="dxa" w:w="60"/>
+              <w:left w:type="dxa" w:w="90"/>
+              <w:bottom w:type="dxa" w:w="60"/>
+              <w:right w:type="dxa" w:w="90"/>
+            </w:tcMar>
+          </w:tcPr>
+          <w:p>
+            <w:pPr>
+              <w:spacing w:after="0"/>
+            </w:pPr>
+            <w:r>
+              <w:rPr>
+                <w:b/>
+                <w:bCs/>
+                <w:color w:val="FFFFFF"/>
+              </w:rPr>
+              <w:t xml:space="preserve">Acceptance criteria</w:t>
+            </w:r>
+          </w:p>
+        </w:tc>
+      </w:tr>
+      <w:tr>
+        <w:tc>
+          <w:tcPr>
+            <w:tcW w:type="auto" w:w="100"/>
+            <w:tcBorders>
+              <w:top w:val="single" w:color="D9D5CD" w:sz="2"/>
+              <w:left w:val="single" w:color="D9D5CD" w:sz="2"/>
+              <w:bottom w:val="single" w:color="D9D5CD" w:sz="2"/>
+              <w:right w:val="single" w:color="D9D5CD" w:sz="2"/>
+            </w:tcBorders>
+            <w:tcMar>
+              <w:top w:type="dxa" w:w="60"/>
+              <w:left w:type="dxa" w:w="90"/>
+              <w:bottom w:type="dxa" w:w="60"/>
+              <w:right w:type="dxa" w:w="90"/>
+            </w:tcMar>
+          </w:tcPr>
+          <w:p>
+            <w:pPr>
+              <w:spacing w:after="0"/>
+            </w:pPr>
+            <w:r>
+              <w:rPr>
+                <w:color w:val="0D1B2A"/>
+              </w:rPr>
+              <w:t xml:space="preserve">FR-FG-001</w:t>
+            </w:r>
+          </w:p>
+        </w:tc>
+        <w:tc>
+          <w:tcPr>
+            <w:tcW w:type="auto" w:w="100"/>
+            <w:tcBorders>
+              <w:top w:val="single" w:color="D9D5CD" w:sz="2"/>
+              <w:left w:val="single" w:color="D9D5CD" w:sz="2"/>
+              <w:bottom w:val="single" w:color="D9D5CD" w:sz="2"/>
+              <w:right w:val="single" w:color="D9D5CD" w:sz="2"/>
+            </w:tcBorders>
+            <w:tcMar>
+              <w:top w:type="dxa" w:w="60"/>
+              <w:left w:type="dxa" w:w="90"/>
+              <w:bottom w:type="dxa" w:w="60"/>
+              <w:right w:type="dxa" w:w="90"/>
+            </w:tcMar>
+          </w:tcPr>
+          <w:p>
+            <w:pPr>
+              <w:spacing w:after="0"/>
+            </w:pPr>
+            <w:r>
+              <w:rPr>
+                <w:color w:val="0D1B2A"/>
+              </w:rPr>
+              <w:t xml:space="preserve">M</w:t>
+            </w:r>
+          </w:p>
+        </w:tc>
+        <w:tc>
+          <w:tcPr>
+            <w:tcW w:type="auto" w:w="100"/>
+            <w:tcBorders>
+              <w:top w:val="single" w:color="D9D5CD" w:sz="2"/>
+              <w:left w:val="single" w:color="D9D5CD" w:sz="2"/>
+              <w:bottom w:val="single" w:color="D9D5CD" w:sz="2"/>
+              <w:right w:val="single" w:color="D9D5CD" w:sz="2"/>
+            </w:tcBorders>
+            <w:tcMar>
+              <w:top w:type="dxa" w:w="60"/>
+              <w:left w:type="dxa" w:w="90"/>
+              <w:bottom w:type="dxa" w:w="60"/>
+              <w:right w:type="dxa" w:w="90"/>
+            </w:tcMar>
+          </w:tcPr>
+          <w:p>
+            <w:pPr>
+              <w:spacing w:after="0"/>
+            </w:pPr>
+            <w:r>
+              <w:rPr>
+                <w:color w:val="0D1B2A"/>
+              </w:rPr>
+              <w:t xml:space="preserve">The system SHALL represent </w:t>
+            </w:r>
+            <w:r>
+              <w:rPr>
+                <w:b/>
+                <w:bCs/>
+                <w:color w:val="0D1B2A"/>
+              </w:rPr>
+              <w:t xml:space="preserve">domains</w:t>
+            </w:r>
+            <w:r>
+              <w:rPr>
+                <w:color w:val="0D1B2A"/>
+              </w:rPr>
+              <w:t xml:space="preserve"> as first-class objects with an owner group, description, and SLAs.</w:t>
+            </w:r>
+          </w:p>
+        </w:tc>
+        <w:tc>
+          <w:tcPr>
+            <w:tcW w:type="auto" w:w="100"/>
+            <w:tcBorders>
+              <w:top w:val="single" w:color="D9D5CD" w:sz="2"/>
+              <w:left w:val="single" w:color="D9D5CD" w:sz="2"/>
+              <w:bottom w:val="single" w:color="D9D5CD" w:sz="2"/>
+              <w:right w:val="single" w:color="D9D5CD" w:sz="2"/>
+            </w:tcBorders>
+            <w:tcMar>
+              <w:top w:type="dxa" w:w="60"/>
+              <w:left w:type="dxa" w:w="90"/>
+              <w:bottom w:type="dxa" w:w="60"/>
+              <w:right w:type="dxa" w:w="90"/>
+            </w:tcMar>
+          </w:tcPr>
+          <w:p>
+            <w:pPr>
+              <w:spacing w:after="0"/>
+            </w:pPr>
+            <w:r>
+              <w:rPr>
+                <w:color w:val="0D1B2A"/>
+              </w:rPr>
+              <w:t xml:space="preserve">A domain can be created with an owner group; models belong to a domain.</w:t>
+            </w:r>
+          </w:p>
+        </w:tc>
+      </w:tr>
+      <w:tr>
+        <w:tc>
+          <w:tcPr>
+            <w:tcW w:type="auto" w:w="100"/>
+            <w:tcBorders>
+              <w:top w:val="single" w:color="D9D5CD" w:sz="2"/>
+              <w:left w:val="single" w:color="D9D5CD" w:sz="2"/>
+              <w:bottom w:val="single" w:color="D9D5CD" w:sz="2"/>
+              <w:right w:val="single" w:color="D9D5CD" w:sz="2"/>
+            </w:tcBorders>
+            <w:shd w:color="F1EFE9" w:val="solid"/>
+            <w:tcMar>
+              <w:top w:type="dxa" w:w="60"/>
+              <w:left w:type="dxa" w:w="90"/>
+              <w:bottom w:type="dxa" w:w="60"/>
+              <w:right w:type="dxa" w:w="90"/>
+            </w:tcMar>
+          </w:tcPr>
+          <w:p>
+            <w:pPr>
+              <w:spacing w:after="0"/>
+            </w:pPr>
+            <w:r>
+              <w:rPr>
+                <w:color w:val="0D1B2A"/>
+              </w:rPr>
+              <w:t xml:space="preserve">FR-FG-002</w:t>
+            </w:r>
+          </w:p>
+        </w:tc>
+        <w:tc>
+          <w:tcPr>
+            <w:tcW w:type="auto" w:w="100"/>
+            <w:tcBorders>
+              <w:top w:val="single" w:color="D9D5CD" w:sz="2"/>
+              <w:left w:val="single" w:color="D9D5CD" w:sz="2"/>
+              <w:bottom w:val="single" w:color="D9D5CD" w:sz="2"/>
+              <w:right w:val="single" w:color="D9D5CD" w:sz="2"/>
+            </w:tcBorders>
+            <w:shd w:color="F1EFE9" w:val="solid"/>
+            <w:tcMar>
+              <w:top w:type="dxa" w:w="60"/>
+              <w:left w:type="dxa" w:w="90"/>
+              <w:bottom w:type="dxa" w:w="60"/>
+              <w:right w:type="dxa" w:w="90"/>
+            </w:tcMar>
+          </w:tcPr>
+          <w:p>
+            <w:pPr>
+              <w:spacing w:after="0"/>
+            </w:pPr>
+            <w:r>
+              <w:rPr>
+                <w:color w:val="0D1B2A"/>
+              </w:rPr>
+              <w:t xml:space="preserve">M</w:t>
+            </w:r>
+          </w:p>
+        </w:tc>
+        <w:tc>
+          <w:tcPr>
+            <w:tcW w:type="auto" w:w="100"/>
+            <w:tcBorders>
+              <w:top w:val="single" w:color="D9D5CD" w:sz="2"/>
+              <w:left w:val="single" w:color="D9D5CD" w:sz="2"/>
+              <w:bottom w:val="single" w:color="D9D5CD" w:sz="2"/>
+              <w:right w:val="single" w:color="D9D5CD" w:sz="2"/>
+            </w:tcBorders>
+            <w:shd w:color="F1EFE9" w:val="solid"/>
+            <w:tcMar>
+              <w:top w:type="dxa" w:w="60"/>
+              <w:left w:type="dxa" w:w="90"/>
+              <w:bottom w:type="dxa" w:w="60"/>
+              <w:right w:type="dxa" w:w="90"/>
+            </w:tcMar>
+          </w:tcPr>
+          <w:p>
+            <w:pPr>
+              <w:spacing w:after="0"/>
+            </w:pPr>
+            <w:r>
+              <w:rPr>
+                <w:color w:val="0D1B2A"/>
+              </w:rPr>
+              <w:t xml:space="preserve">Every model SHALL belong to exactly one </w:t>
+            </w:r>
+            <w:r>
+              <w:rPr>
+                <w:b/>
+                <w:bCs/>
+                <w:color w:val="0D1B2A"/>
+              </w:rPr>
+              <w:t xml:space="preserve">owning domain</w:t>
+            </w:r>
+            <w:r>
+              <w:rPr>
+                <w:color w:val="0D1B2A"/>
+              </w:rPr>
+              <w:t xml:space="preserve">; domain ownership SHALL be expressed as data (</w:t>
+            </w:r>
+            <w:r>
+              <w:rPr>
+                <w:rFonts w:ascii="Consolas" w:cs="Consolas" w:eastAsia="Consolas" w:hAnsi="Consolas"/>
+                <w:color w:val="0D1B2A"/>
+              </w:rPr>
+              <w:t xml:space="preserve">domain.yaml</w:t>
+            </w:r>
+            <w:r>
+              <w:rPr>
+                <w:color w:val="0D1B2A"/>
+              </w:rPr>
+              <w:t xml:space="preserve"> + </w:t>
+            </w:r>
+            <w:r>
+              <w:rPr>
+                <w:rFonts w:ascii="Consolas" w:cs="Consolas" w:eastAsia="Consolas" w:hAnsi="Consolas"/>
+                <w:color w:val="0D1B2A"/>
+              </w:rPr>
+              <w:t xml:space="preserve">CODEOWNERS</w:t>
+            </w:r>
+            <w:r>
+              <w:rPr>
+                <w:color w:val="0D1B2A"/>
+              </w:rPr>
+              <w:t xml:space="preserve"> + IdP-group mapping).</w:t>
+            </w:r>
+          </w:p>
+        </w:tc>
+        <w:tc>
+          <w:tcPr>
+            <w:tcW w:type="auto" w:w="100"/>
+            <w:tcBorders>
+              <w:top w:val="single" w:color="D9D5CD" w:sz="2"/>
+              <w:left w:val="single" w:color="D9D5CD" w:sz="2"/>
+              <w:bottom w:val="single" w:color="D9D5CD" w:sz="2"/>
+              <w:right w:val="single" w:color="D9D5CD" w:sz="2"/>
+            </w:tcBorders>
+            <w:shd w:color="F1EFE9" w:val="solid"/>
+            <w:tcMar>
+              <w:top w:type="dxa" w:w="60"/>
+              <w:left w:type="dxa" w:w="90"/>
+              <w:bottom w:type="dxa" w:w="60"/>
+              <w:right w:type="dxa" w:w="90"/>
+            </w:tcMar>
+          </w:tcPr>
+          <w:p>
+            <w:pPr>
+              <w:spacing w:after="0"/>
+            </w:pPr>
+            <w:r>
+              <w:rPr>
+                <w:color w:val="0D1B2A"/>
+              </w:rPr>
+              <w:t xml:space="preserve">A model's domain and steward group are resolvable from configuration.</w:t>
+            </w:r>
+          </w:p>
+        </w:tc>
+      </w:tr>
+      <w:tr>
+        <w:tc>
+          <w:tcPr>
+            <w:tcW w:type="auto" w:w="100"/>
+            <w:tcBorders>
+              <w:top w:val="single" w:color="D9D5CD" w:sz="2"/>
+              <w:left w:val="single" w:color="D9D5CD" w:sz="2"/>
+              <w:bottom w:val="single" w:color="D9D5CD" w:sz="2"/>
+              <w:right w:val="single" w:color="D9D5CD" w:sz="2"/>
+            </w:tcBorders>
+            <w:tcMar>
+              <w:top w:type="dxa" w:w="60"/>
+              <w:left w:type="dxa" w:w="90"/>
+              <w:bottom w:type="dxa" w:w="60"/>
+              <w:right w:type="dxa" w:w="90"/>
+            </w:tcMar>
+          </w:tcPr>
+          <w:p>
+            <w:pPr>
+              <w:spacing w:after="0"/>
+            </w:pPr>
+            <w:r>
+              <w:rPr>
+                <w:color w:val="0D1B2A"/>
+              </w:rPr>
+              <w:t xml:space="preserve">FR-FG-003</w:t>
+            </w:r>
+          </w:p>
+        </w:tc>
+        <w:tc>
+          <w:tcPr>
+            <w:tcW w:type="auto" w:w="100"/>
+            <w:tcBorders>
+              <w:top w:val="single" w:color="D9D5CD" w:sz="2"/>
+              <w:left w:val="single" w:color="D9D5CD" w:sz="2"/>
+              <w:bottom w:val="single" w:color="D9D5CD" w:sz="2"/>
+              <w:right w:val="single" w:color="D9D5CD" w:sz="2"/>
+            </w:tcBorders>
+            <w:tcMar>
+              <w:top w:type="dxa" w:w="60"/>
+              <w:left w:type="dxa" w:w="90"/>
+              <w:bottom w:type="dxa" w:w="60"/>
+              <w:right w:type="dxa" w:w="90"/>
+            </w:tcMar>
+          </w:tcPr>
+          <w:p>
+            <w:pPr>
+              <w:spacing w:after="0"/>
+            </w:pPr>
+            <w:r>
+              <w:rPr>
+                <w:color w:val="0D1B2A"/>
+              </w:rPr>
+              <w:t xml:space="preserve">M</w:t>
+            </w:r>
+          </w:p>
+        </w:tc>
+        <w:tc>
+          <w:tcPr>
+            <w:tcW w:type="auto" w:w="100"/>
+            <w:tcBorders>
+              <w:top w:val="single" w:color="D9D5CD" w:sz="2"/>
+              <w:left w:val="single" w:color="D9D5CD" w:sz="2"/>
+              <w:bottom w:val="single" w:color="D9D5CD" w:sz="2"/>
+              <w:right w:val="single" w:color="D9D5CD" w:sz="2"/>
+            </w:tcBorders>
+            <w:tcMar>
+              <w:top w:type="dxa" w:w="60"/>
+              <w:left w:type="dxa" w:w="90"/>
+              <w:bottom w:type="dxa" w:w="60"/>
+              <w:right w:type="dxa" w:w="90"/>
+            </w:tcMar>
+          </w:tcPr>
+          <w:p>
+            <w:pPr>
+              <w:spacing w:after="0"/>
+            </w:pPr>
+            <w:r>
+              <w:rPr>
+                <w:color w:val="0D1B2A"/>
+              </w:rPr>
+              <w:t xml:space="preserve">The system SHALL route a ChangeSet's </w:t>
+            </w:r>
+            <w:r>
+              <w:rPr>
+                <w:b/>
+                <w:bCs/>
+                <w:color w:val="0D1B2A"/>
+              </w:rPr>
+              <w:t xml:space="preserve">domain-tier reviewers</w:t>
+            </w:r>
+            <w:r>
+              <w:rPr>
+                <w:color w:val="0D1B2A"/>
+              </w:rPr>
+              <w:t xml:space="preserve"> automatically from the owning domain's steward group.</w:t>
+            </w:r>
+          </w:p>
+        </w:tc>
+        <w:tc>
+          <w:tcPr>
+            <w:tcW w:type="auto" w:w="100"/>
+            <w:tcBorders>
+              <w:top w:val="single" w:color="D9D5CD" w:sz="2"/>
+              <w:left w:val="single" w:color="D9D5CD" w:sz="2"/>
+              <w:bottom w:val="single" w:color="D9D5CD" w:sz="2"/>
+              <w:right w:val="single" w:color="D9D5CD" w:sz="2"/>
+            </w:tcBorders>
+            <w:tcMar>
+              <w:top w:type="dxa" w:w="60"/>
+              <w:left w:type="dxa" w:w="90"/>
+              <w:bottom w:type="dxa" w:w="60"/>
+              <w:right w:type="dxa" w:w="90"/>
+            </w:tcMar>
+          </w:tcPr>
+          <w:p>
+            <w:pPr>
+              <w:spacing w:after="0"/>
+            </w:pPr>
+            <w:r>
+              <w:rPr>
+                <w:color w:val="0D1B2A"/>
+              </w:rPr>
+              <w:t xml:space="preserve">Reviewers are assigned from the correct domain on propose.</w:t>
+            </w:r>
+          </w:p>
+        </w:tc>
+      </w:tr>
+      <w:tr>
+        <w:tc>
+          <w:tcPr>
+            <w:tcW w:type="auto" w:w="100"/>
+            <w:tcBorders>
+              <w:top w:val="single" w:color="D9D5CD" w:sz="2"/>
+              <w:left w:val="single" w:color="D9D5CD" w:sz="2"/>
+              <w:bottom w:val="single" w:color="D9D5CD" w:sz="2"/>
+              <w:right w:val="single" w:color="D9D5CD" w:sz="2"/>
+            </w:tcBorders>
+            <w:shd w:color="F1EFE9" w:val="solid"/>
+            <w:tcMar>
+              <w:top w:type="dxa" w:w="60"/>
+              <w:left w:type="dxa" w:w="90"/>
+              <w:bottom w:type="dxa" w:w="60"/>
+              <w:right w:type="dxa" w:w="90"/>
+            </w:tcMar>
+          </w:tcPr>
+          <w:p>
+            <w:pPr>
+              <w:spacing w:after="0"/>
+            </w:pPr>
+            <w:r>
+              <w:rPr>
+                <w:color w:val="0D1B2A"/>
+              </w:rPr>
+              <w:t xml:space="preserve">FR-FG-004</w:t>
+            </w:r>
+          </w:p>
+        </w:tc>
+        <w:tc>
+          <w:tcPr>
+            <w:tcW w:type="auto" w:w="100"/>
+            <w:tcBorders>
+              <w:top w:val="single" w:color="D9D5CD" w:sz="2"/>
+              <w:left w:val="single" w:color="D9D5CD" w:sz="2"/>
+              <w:bottom w:val="single" w:color="D9D5CD" w:sz="2"/>
+              <w:right w:val="single" w:color="D9D5CD" w:sz="2"/>
+            </w:tcBorders>
+            <w:shd w:color="F1EFE9" w:val="solid"/>
+            <w:tcMar>
+              <w:top w:type="dxa" w:w="60"/>
+              <w:left w:type="dxa" w:w="90"/>
+              <w:bottom w:type="dxa" w:w="60"/>
+              <w:right w:type="dxa" w:w="90"/>
+            </w:tcMar>
+          </w:tcPr>
+          <w:p>
+            <w:pPr>
+              <w:spacing w:after="0"/>
+            </w:pPr>
+            <w:r>
+              <w:rPr>
+                <w:color w:val="0D1B2A"/>
+              </w:rPr>
+              <w:t xml:space="preserve">M</w:t>
+            </w:r>
+          </w:p>
+        </w:tc>
+        <w:tc>
+          <w:tcPr>
+            <w:tcW w:type="auto" w:w="100"/>
+            <w:tcBorders>
+              <w:top w:val="single" w:color="D9D5CD" w:sz="2"/>
+              <w:left w:val="single" w:color="D9D5CD" w:sz="2"/>
+              <w:bottom w:val="single" w:color="D9D5CD" w:sz="2"/>
+              <w:right w:val="single" w:color="D9D5CD" w:sz="2"/>
+            </w:tcBorders>
+            <w:shd w:color="F1EFE9" w:val="solid"/>
+            <w:tcMar>
+              <w:top w:type="dxa" w:w="60"/>
+              <w:left w:type="dxa" w:w="90"/>
+              <w:bottom w:type="dxa" w:w="60"/>
+              <w:right w:type="dxa" w:w="90"/>
+            </w:tcMar>
+          </w:tcPr>
+          <w:p>
+            <w:pPr>
+              <w:spacing w:after="0"/>
+            </w:pPr>
+            <w:r>
+              <w:rPr>
+                <w:color w:val="0D1B2A"/>
+              </w:rPr>
+              <w:t xml:space="preserve">Models SHALL carry a </w:t>
+            </w:r>
+            <w:r>
+              <w:rPr>
+                <w:b/>
+                <w:bCs/>
+                <w:color w:val="0D1B2A"/>
+              </w:rPr>
+              <w:t xml:space="preserve">scope</w:t>
+            </w:r>
+            <w:r>
+              <w:rPr>
+                <w:color w:val="0D1B2A"/>
+              </w:rPr>
+              <w:t xml:space="preserve">: </w:t>
+            </w:r>
+            <w:r>
+              <w:rPr>
+                <w:rFonts w:ascii="Consolas" w:cs="Consolas" w:eastAsia="Consolas" w:hAnsi="Consolas"/>
+                <w:color w:val="0D1B2A"/>
+              </w:rPr>
+              <w:t xml:space="preserve">domain</w:t>
+            </w:r>
+            <w:r>
+              <w:rPr>
+                <w:color w:val="0D1B2A"/>
+              </w:rPr>
+              <w:t xml:space="preserve">, </w:t>
+            </w:r>
+            <w:r>
+              <w:rPr>
+                <w:rFonts w:ascii="Consolas" w:cs="Consolas" w:eastAsia="Consolas" w:hAnsi="Consolas"/>
+                <w:color w:val="0D1B2A"/>
+              </w:rPr>
+              <w:t xml:space="preserve">shared</w:t>
+            </w:r>
+            <w:r>
+              <w:rPr>
+                <w:color w:val="0D1B2A"/>
+              </w:rPr>
+              <w:t xml:space="preserve">, or </w:t>
+            </w:r>
+            <w:r>
+              <w:rPr>
+                <w:rFonts w:ascii="Consolas" w:cs="Consolas" w:eastAsia="Consolas" w:hAnsi="Consolas"/>
+                <w:color w:val="0D1B2A"/>
+              </w:rPr>
+              <w:t xml:space="preserve">enterprise</w:t>
+            </w:r>
+            <w:r>
+              <w:rPr>
+                <w:color w:val="0D1B2A"/>
+              </w:rPr>
+              <w:t xml:space="preserve">. </w:t>
+            </w:r>
+            <w:r>
+              <w:rPr>
+                <w:rFonts w:ascii="Consolas" w:cs="Consolas" w:eastAsia="Consolas" w:hAnsi="Consolas"/>
+                <w:color w:val="0D1B2A"/>
+              </w:rPr>
+              <w:t xml:space="preserve">shared</w:t>
+            </w:r>
+            <w:r>
+              <w:rPr>
+                <w:color w:val="0D1B2A"/>
+              </w:rPr>
+              <w:t xml:space="preserve">/</w:t>
+            </w:r>
+            <w:r>
+              <w:rPr>
+                <w:rFonts w:ascii="Consolas" w:cs="Consolas" w:eastAsia="Consolas" w:hAnsi="Consolas"/>
+                <w:color w:val="0D1B2A"/>
+              </w:rPr>
+              <w:t xml:space="preserve">enterprise</w:t>
+            </w:r>
+            <w:r>
+              <w:rPr>
+                <w:color w:val="0D1B2A"/>
+              </w:rPr>
+              <w:t xml:space="preserve"> models are governed centrally (CDA).</w:t>
+            </w:r>
+          </w:p>
+        </w:tc>
+        <w:tc>
+          <w:tcPr>
+            <w:tcW w:type="auto" w:w="100"/>
+            <w:tcBorders>
+              <w:top w:val="single" w:color="D9D5CD" w:sz="2"/>
+              <w:left w:val="single" w:color="D9D5CD" w:sz="2"/>
+              <w:bottom w:val="single" w:color="D9D5CD" w:sz="2"/>
+              <w:right w:val="single" w:color="D9D5CD" w:sz="2"/>
+            </w:tcBorders>
+            <w:shd w:color="F1EFE9" w:val="solid"/>
+            <w:tcMar>
+              <w:top w:type="dxa" w:w="60"/>
+              <w:left w:type="dxa" w:w="90"/>
+              <w:bottom w:type="dxa" w:w="60"/>
+              <w:right w:type="dxa" w:w="90"/>
+            </w:tcMar>
+          </w:tcPr>
+          <w:p>
+            <w:pPr>
+              <w:spacing w:after="0"/>
+            </w:pPr>
+            <w:r>
+              <w:rPr>
+                <w:color w:val="0D1B2A"/>
+              </w:rPr>
+              <w:t xml:space="preserve">A model's scope persists and drives routing.</w:t>
+            </w:r>
+          </w:p>
+        </w:tc>
+      </w:tr>
+      <w:tr>
+        <w:tc>
+          <w:tcPr>
+            <w:tcW w:type="auto" w:w="100"/>
+            <w:tcBorders>
+              <w:top w:val="single" w:color="D9D5CD" w:sz="2"/>
+              <w:left w:val="single" w:color="D9D5CD" w:sz="2"/>
+              <w:bottom w:val="single" w:color="D9D5CD" w:sz="2"/>
+              <w:right w:val="single" w:color="D9D5CD" w:sz="2"/>
+            </w:tcBorders>
+            <w:tcMar>
+              <w:top w:type="dxa" w:w="60"/>
+              <w:left w:type="dxa" w:w="90"/>
+              <w:bottom w:type="dxa" w:w="60"/>
+              <w:right w:type="dxa" w:w="90"/>
+            </w:tcMar>
+          </w:tcPr>
+          <w:p>
+            <w:pPr>
+              <w:spacing w:after="0"/>
+            </w:pPr>
+            <w:r>
+              <w:rPr>
+                <w:color w:val="0D1B2A"/>
+              </w:rPr>
+              <w:t xml:space="preserve">FR-FG-005</w:t>
+            </w:r>
+          </w:p>
+        </w:tc>
+        <w:tc>
+          <w:tcPr>
+            <w:tcW w:type="auto" w:w="100"/>
+            <w:tcBorders>
+              <w:top w:val="single" w:color="D9D5CD" w:sz="2"/>
+              <w:left w:val="single" w:color="D9D5CD" w:sz="2"/>
+              <w:bottom w:val="single" w:color="D9D5CD" w:sz="2"/>
+              <w:right w:val="single" w:color="D9D5CD" w:sz="2"/>
+            </w:tcBorders>
+            <w:tcMar>
+              <w:top w:type="dxa" w:w="60"/>
+              <w:left w:type="dxa" w:w="90"/>
+              <w:bottom w:type="dxa" w:w="60"/>
+              <w:right w:type="dxa" w:w="90"/>
+            </w:tcMar>
+          </w:tcPr>
+          <w:p>
+            <w:pPr>
+              <w:spacing w:after="0"/>
+            </w:pPr>
+            <w:r>
+              <w:rPr>
+                <w:color w:val="0D1B2A"/>
+              </w:rPr>
+              <w:t xml:space="preserve">S</w:t>
+            </w:r>
+          </w:p>
+        </w:tc>
+        <w:tc>
+          <w:tcPr>
+            <w:tcW w:type="auto" w:w="100"/>
+            <w:tcBorders>
+              <w:top w:val="single" w:color="D9D5CD" w:sz="2"/>
+              <w:left w:val="single" w:color="D9D5CD" w:sz="2"/>
+              <w:bottom w:val="single" w:color="D9D5CD" w:sz="2"/>
+              <w:right w:val="single" w:color="D9D5CD" w:sz="2"/>
+            </w:tcBorders>
+            <w:tcMar>
+              <w:top w:type="dxa" w:w="60"/>
+              <w:left w:type="dxa" w:w="90"/>
+              <w:bottom w:type="dxa" w:w="60"/>
+              <w:right w:type="dxa" w:w="90"/>
+            </w:tcMar>
+          </w:tcPr>
+          <w:p>
+            <w:pPr>
+              <w:spacing w:after="0"/>
+            </w:pPr>
+            <w:r>
+              <w:rPr>
+                <w:color w:val="0D1B2A"/>
+              </w:rPr>
+              <w:t xml:space="preserve">The system SHALL provide a </w:t>
+            </w:r>
+            <w:r>
+              <w:rPr>
+                <w:b/>
+                <w:bCs/>
+                <w:color w:val="0D1B2A"/>
+              </w:rPr>
+              <w:t xml:space="preserve">federation registry</w:t>
+            </w:r>
+            <w:r>
+              <w:rPr>
+                <w:color w:val="0D1B2A"/>
+              </w:rPr>
+              <w:t xml:space="preserve">: domains, owners, conformed/shared models, and pending sign-offs.</w:t>
+            </w:r>
+          </w:p>
+        </w:tc>
+        <w:tc>
+          <w:tcPr>
+            <w:tcW w:type="auto" w:w="100"/>
+            <w:tcBorders>
+              <w:top w:val="single" w:color="D9D5CD" w:sz="2"/>
+              <w:left w:val="single" w:color="D9D5CD" w:sz="2"/>
+              <w:bottom w:val="single" w:color="D9D5CD" w:sz="2"/>
+              <w:right w:val="single" w:color="D9D5CD" w:sz="2"/>
+            </w:tcBorders>
+            <w:tcMar>
+              <w:top w:type="dxa" w:w="60"/>
+              <w:left w:type="dxa" w:w="90"/>
+              <w:bottom w:type="dxa" w:w="60"/>
+              <w:right w:type="dxa" w:w="90"/>
+            </w:tcMar>
+          </w:tcPr>
+          <w:p>
+            <w:pPr>
+              <w:spacing w:after="0"/>
+            </w:pPr>
+            <w:r>
+              <w:rPr>
+                <w:color w:val="0D1B2A"/>
+              </w:rPr>
+              <w:t xml:space="preserve">The registry lists domains, owners, and shared models.</w:t>
+            </w:r>
+          </w:p>
+        </w:tc>
+      </w:tr>
+    </w:tbl>
+    <w:p>
+      <w:pPr>
+        <w:spacing w:after="120"/>
+      </w:pPr>
+    </w:p>
+    <w:p>
+      <w:pPr>
+        <w:pStyle w:val="Heading2"/>
+        <w:spacing w:after="80" w:before="220"/>
+      </w:pPr>
+      <w:r>
+        <w:rPr>
+          <w:b/>
+          <w:bCs/>
+          <w:color w:val="15756B"/>
+        </w:rPr>
+        <w:t xml:space="preserve">7.2 Roles &amp; decision rights</w:t>
+      </w:r>
+    </w:p>
+    <w:tbl>
+      <w:tblPr>
+        <w:tblW w:type="pct" w:w="100%"/>
+        <w:tblBorders>
+          <w:top w:val="single" w:color="D9D5CD" w:sz="2"/>
+          <w:left w:val="single" w:color="D9D5CD" w:sz="2"/>
+          <w:bottom w:val="single" w:color="D9D5CD" w:sz="2"/>
+          <w:right w:val="single" w:color="D9D5CD" w:sz="2"/>
+          <w:insideH w:val="single" w:color="auto" w:sz="4"/>
+          <w:insideV w:val="single" w:color="auto" w:sz="4"/>
+        </w:tblBorders>
+      </w:tblPr>
+      <w:tblGrid>
+        <w:gridCol w:w="100"/>
+        <w:gridCol w:w="100"/>
+        <w:gridCol w:w="100"/>
+        <w:gridCol w:w="100"/>
+      </w:tblGrid>
+      <w:tr>
+        <w:trPr>
+          <w:tblHeader/>
+        </w:trPr>
+        <w:tc>
+          <w:tcPr>
+            <w:tcW w:type="auto" w:w="100"/>
+            <w:tcBorders>
+              <w:top w:val="single" w:color="D9D5CD" w:sz="2"/>
+              <w:left w:val="single" w:color="D9D5CD" w:sz="2"/>
+              <w:bottom w:val="single" w:color="D9D5CD" w:sz="2"/>
+              <w:right w:val="single" w:color="D9D5CD" w:sz="2"/>
+            </w:tcBorders>
+            <w:shd w:color="0D1B2A" w:val="solid"/>
+            <w:tcMar>
+              <w:top w:type="dxa" w:w="60"/>
+              <w:left w:type="dxa" w:w="90"/>
+              <w:bottom w:type="dxa" w:w="60"/>
+              <w:right w:type="dxa" w:w="90"/>
+            </w:tcMar>
+          </w:tcPr>
+          <w:p>
+            <w:pPr>
+              <w:spacing w:after="0"/>
+            </w:pPr>
+            <w:r>
+              <w:rPr>
+                <w:b/>
+                <w:bCs/>
+                <w:color w:val="FFFFFF"/>
+              </w:rPr>
+              <w:t xml:space="preserve">ID</w:t>
+            </w:r>
+          </w:p>
+        </w:tc>
+        <w:tc>
+          <w:tcPr>
+            <w:tcW w:type="auto" w:w="100"/>
+            <w:tcBorders>
+              <w:top w:val="single" w:color="D9D5CD" w:sz="2"/>
+              <w:left w:val="single" w:color="D9D5CD" w:sz="2"/>
+              <w:bottom w:val="single" w:color="D9D5CD" w:sz="2"/>
+              <w:right w:val="single" w:color="D9D5CD" w:sz="2"/>
+            </w:tcBorders>
+            <w:shd w:color="0D1B2A" w:val="solid"/>
+            <w:tcMar>
+              <w:top w:type="dxa" w:w="60"/>
+              <w:left w:type="dxa" w:w="90"/>
+              <w:bottom w:type="dxa" w:w="60"/>
+              <w:right w:type="dxa" w:w="90"/>
+            </w:tcMar>
+          </w:tcPr>
+          <w:p>
+            <w:pPr>
+              <w:spacing w:after="0"/>
+            </w:pPr>
+            <w:r>
+              <w:rPr>
+                <w:b/>
+                <w:bCs/>
+                <w:color w:val="FFFFFF"/>
+              </w:rPr>
+              <w:t xml:space="preserve">Pri</w:t>
+            </w:r>
+          </w:p>
+        </w:tc>
+        <w:tc>
+          <w:tcPr>
+            <w:tcW w:type="auto" w:w="100"/>
+            <w:tcBorders>
+              <w:top w:val="single" w:color="D9D5CD" w:sz="2"/>
+              <w:left w:val="single" w:color="D9D5CD" w:sz="2"/>
+              <w:bottom w:val="single" w:color="D9D5CD" w:sz="2"/>
+              <w:right w:val="single" w:color="D9D5CD" w:sz="2"/>
+            </w:tcBorders>
+            <w:shd w:color="0D1B2A" w:val="solid"/>
+            <w:tcMar>
+              <w:top w:type="dxa" w:w="60"/>
+              <w:left w:type="dxa" w:w="90"/>
+              <w:bottom w:type="dxa" w:w="60"/>
+              <w:right w:type="dxa" w:w="90"/>
+            </w:tcMar>
+          </w:tcPr>
+          <w:p>
+            <w:pPr>
+              <w:spacing w:after="0"/>
+            </w:pPr>
+            <w:r>
+              <w:rPr>
+                <w:b/>
+                <w:bCs/>
+                <w:color w:val="FFFFFF"/>
+              </w:rPr>
+              <w:t xml:space="preserve">Requirement</w:t>
+            </w:r>
+          </w:p>
+        </w:tc>
+        <w:tc>
+          <w:tcPr>
+            <w:tcW w:type="auto" w:w="100"/>
+            <w:tcBorders>
+              <w:top w:val="single" w:color="D9D5CD" w:sz="2"/>
+              <w:left w:val="single" w:color="D9D5CD" w:sz="2"/>
+              <w:bottom w:val="single" w:color="D9D5CD" w:sz="2"/>
+              <w:right w:val="single" w:color="D9D5CD" w:sz="2"/>
+            </w:tcBorders>
+            <w:shd w:color="0D1B2A" w:val="solid"/>
+            <w:tcMar>
+              <w:top w:type="dxa" w:w="60"/>
+              <w:left w:type="dxa" w:w="90"/>
+              <w:bottom w:type="dxa" w:w="60"/>
+              <w:right w:type="dxa" w:w="90"/>
+            </w:tcMar>
+          </w:tcPr>
+          <w:p>
+            <w:pPr>
+              <w:spacing w:after="0"/>
+            </w:pPr>
+            <w:r>
+              <w:rPr>
+                <w:b/>
+                <w:bCs/>
+                <w:color w:val="FFFFFF"/>
+              </w:rPr>
+              <w:t xml:space="preserve">Acceptance criteria</w:t>
+            </w:r>
+          </w:p>
+        </w:tc>
+      </w:tr>
+      <w:tr>
+        <w:tc>
+          <w:tcPr>
+            <w:tcW w:type="auto" w:w="100"/>
+            <w:tcBorders>
+              <w:top w:val="single" w:color="D9D5CD" w:sz="2"/>
+              <w:left w:val="single" w:color="D9D5CD" w:sz="2"/>
+              <w:bottom w:val="single" w:color="D9D5CD" w:sz="2"/>
+              <w:right w:val="single" w:color="D9D5CD" w:sz="2"/>
+            </w:tcBorders>
+            <w:tcMar>
+              <w:top w:type="dxa" w:w="60"/>
+              <w:left w:type="dxa" w:w="90"/>
+              <w:bottom w:type="dxa" w:w="60"/>
+              <w:right w:type="dxa" w:w="90"/>
+            </w:tcMar>
+          </w:tcPr>
+          <w:p>
+            <w:pPr>
+              <w:spacing w:after="0"/>
+            </w:pPr>
+            <w:r>
+              <w:rPr>
+                <w:color w:val="0D1B2A"/>
+              </w:rPr>
+              <w:t xml:space="preserve">FR-FG-010</w:t>
+            </w:r>
+          </w:p>
+        </w:tc>
+        <w:tc>
+          <w:tcPr>
+            <w:tcW w:type="auto" w:w="100"/>
+            <w:tcBorders>
+              <w:top w:val="single" w:color="D9D5CD" w:sz="2"/>
+              <w:left w:val="single" w:color="D9D5CD" w:sz="2"/>
+              <w:bottom w:val="single" w:color="D9D5CD" w:sz="2"/>
+              <w:right w:val="single" w:color="D9D5CD" w:sz="2"/>
+            </w:tcBorders>
+            <w:tcMar>
+              <w:top w:type="dxa" w:w="60"/>
+              <w:left w:type="dxa" w:w="90"/>
+              <w:bottom w:type="dxa" w:w="60"/>
+              <w:right w:type="dxa" w:w="90"/>
+            </w:tcMar>
+          </w:tcPr>
+          <w:p>
+            <w:pPr>
+              <w:spacing w:after="0"/>
+            </w:pPr>
+            <w:r>
+              <w:rPr>
+                <w:color w:val="0D1B2A"/>
+              </w:rPr>
+              <w:t xml:space="preserve">M</w:t>
+            </w:r>
+          </w:p>
+        </w:tc>
+        <w:tc>
+          <w:tcPr>
+            <w:tcW w:type="auto" w:w="100"/>
+            <w:tcBorders>
+              <w:top w:val="single" w:color="D9D5CD" w:sz="2"/>
+              <w:left w:val="single" w:color="D9D5CD" w:sz="2"/>
+              <w:bottom w:val="single" w:color="D9D5CD" w:sz="2"/>
+              <w:right w:val="single" w:color="D9D5CD" w:sz="2"/>
+            </w:tcBorders>
+            <w:tcMar>
+              <w:top w:type="dxa" w:w="60"/>
+              <w:left w:type="dxa" w:w="90"/>
+              <w:bottom w:type="dxa" w:w="60"/>
+              <w:right w:type="dxa" w:w="90"/>
+            </w:tcMar>
+          </w:tcPr>
+          <w:p>
+            <w:pPr>
+              <w:spacing w:after="0"/>
+            </w:pPr>
+            <w:r>
+              <w:rPr>
+                <w:color w:val="0D1B2A"/>
+              </w:rPr>
+              <w:t xml:space="preserve">The system SHALL provide a </w:t>
+            </w:r>
+            <w:r>
+              <w:rPr>
+                <w:b/>
+                <w:bCs/>
+                <w:color w:val="0D1B2A"/>
+              </w:rPr>
+              <w:t xml:space="preserve">Chief Data Architect (CDA)</w:t>
+            </w:r>
+            <w:r>
+              <w:rPr>
+                <w:color w:val="0D1B2A"/>
+              </w:rPr>
+              <w:t xml:space="preserve"> role with org-wide approval authority and standards-administration capability.</w:t>
+            </w:r>
+          </w:p>
+        </w:tc>
+        <w:tc>
+          <w:tcPr>
+            <w:tcW w:type="auto" w:w="100"/>
+            <w:tcBorders>
+              <w:top w:val="single" w:color="D9D5CD" w:sz="2"/>
+              <w:left w:val="single" w:color="D9D5CD" w:sz="2"/>
+              <w:bottom w:val="single" w:color="D9D5CD" w:sz="2"/>
+              <w:right w:val="single" w:color="D9D5CD" w:sz="2"/>
+            </w:tcBorders>
+            <w:tcMar>
+              <w:top w:type="dxa" w:w="60"/>
+              <w:left w:type="dxa" w:w="90"/>
+              <w:bottom w:type="dxa" w:w="60"/>
+              <w:right w:type="dxa" w:w="90"/>
+            </w:tcMar>
+          </w:tcPr>
+          <w:p>
+            <w:pPr>
+              <w:spacing w:after="0"/>
+            </w:pPr>
+            <w:r>
+              <w:rPr>
+                <w:color w:val="0D1B2A"/>
+              </w:rPr>
+              <w:t xml:space="preserve">A CDA can sign off on any domain's enterprise-significant change and edit enterprise standards.</w:t>
+            </w:r>
+          </w:p>
+        </w:tc>
+      </w:tr>
+      <w:tr>
+        <w:tc>
+          <w:tcPr>
+            <w:tcW w:type="auto" w:w="100"/>
+            <w:tcBorders>
+              <w:top w:val="single" w:color="D9D5CD" w:sz="2"/>
+              <w:left w:val="single" w:color="D9D5CD" w:sz="2"/>
+              <w:bottom w:val="single" w:color="D9D5CD" w:sz="2"/>
+              <w:right w:val="single" w:color="D9D5CD" w:sz="2"/>
+            </w:tcBorders>
+            <w:shd w:color="F1EFE9" w:val="solid"/>
+            <w:tcMar>
+              <w:top w:type="dxa" w:w="60"/>
+              <w:left w:type="dxa" w:w="90"/>
+              <w:bottom w:type="dxa" w:w="60"/>
+              <w:right w:type="dxa" w:w="90"/>
+            </w:tcMar>
+          </w:tcPr>
+          <w:p>
+            <w:pPr>
+              <w:spacing w:after="0"/>
+            </w:pPr>
+            <w:r>
+              <w:rPr>
+                <w:color w:val="0D1B2A"/>
+              </w:rPr>
+              <w:t xml:space="preserve">FR-FG-011</w:t>
+            </w:r>
+          </w:p>
+        </w:tc>
+        <w:tc>
+          <w:tcPr>
+            <w:tcW w:type="auto" w:w="100"/>
+            <w:tcBorders>
+              <w:top w:val="single" w:color="D9D5CD" w:sz="2"/>
+              <w:left w:val="single" w:color="D9D5CD" w:sz="2"/>
+              <w:bottom w:val="single" w:color="D9D5CD" w:sz="2"/>
+              <w:right w:val="single" w:color="D9D5CD" w:sz="2"/>
+            </w:tcBorders>
+            <w:shd w:color="F1EFE9" w:val="solid"/>
+            <w:tcMar>
+              <w:top w:type="dxa" w:w="60"/>
+              <w:left w:type="dxa" w:w="90"/>
+              <w:bottom w:type="dxa" w:w="60"/>
+              <w:right w:type="dxa" w:w="90"/>
+            </w:tcMar>
+          </w:tcPr>
+          <w:p>
+            <w:pPr>
+              <w:spacing w:after="0"/>
+            </w:pPr>
+            <w:r>
+              <w:rPr>
+                <w:color w:val="0D1B2A"/>
+              </w:rPr>
+              <w:t xml:space="preserve">S</w:t>
+            </w:r>
+          </w:p>
+        </w:tc>
+        <w:tc>
+          <w:tcPr>
+            <w:tcW w:type="auto" w:w="100"/>
+            <w:tcBorders>
+              <w:top w:val="single" w:color="D9D5CD" w:sz="2"/>
+              <w:left w:val="single" w:color="D9D5CD" w:sz="2"/>
+              <w:bottom w:val="single" w:color="D9D5CD" w:sz="2"/>
+              <w:right w:val="single" w:color="D9D5CD" w:sz="2"/>
+            </w:tcBorders>
+            <w:shd w:color="F1EFE9" w:val="solid"/>
+            <w:tcMar>
+              <w:top w:type="dxa" w:w="60"/>
+              <w:left w:type="dxa" w:w="90"/>
+              <w:bottom w:type="dxa" w:w="60"/>
+              <w:right w:type="dxa" w:w="90"/>
+            </w:tcMar>
+          </w:tcPr>
+          <w:p>
+            <w:pPr>
+              <w:spacing w:after="0"/>
+            </w:pPr>
+            <w:r>
+              <w:rPr>
+                <w:color w:val="0D1B2A"/>
+              </w:rPr>
+              <w:t xml:space="preserve">The system SHALL support an </w:t>
+            </w:r>
+            <w:r>
+              <w:rPr>
+                <w:b/>
+                <w:bCs/>
+                <w:color w:val="0D1B2A"/>
+              </w:rPr>
+              <w:t xml:space="preserve">Architecture Review Board (ARB)</w:t>
+            </w:r>
+            <w:r>
+              <w:rPr>
+                <w:color w:val="0D1B2A"/>
+              </w:rPr>
+              <w:t xml:space="preserve"> role to which the CDA MAY delegate sign-off by quorum.</w:t>
+            </w:r>
+          </w:p>
+        </w:tc>
+        <w:tc>
+          <w:tcPr>
+            <w:tcW w:type="auto" w:w="100"/>
+            <w:tcBorders>
+              <w:top w:val="single" w:color="D9D5CD" w:sz="2"/>
+              <w:left w:val="single" w:color="D9D5CD" w:sz="2"/>
+              <w:bottom w:val="single" w:color="D9D5CD" w:sz="2"/>
+              <w:right w:val="single" w:color="D9D5CD" w:sz="2"/>
+            </w:tcBorders>
+            <w:shd w:color="F1EFE9" w:val="solid"/>
+            <w:tcMar>
+              <w:top w:type="dxa" w:w="60"/>
+              <w:left w:type="dxa" w:w="90"/>
+              <w:bottom w:type="dxa" w:w="60"/>
+              <w:right w:type="dxa" w:w="90"/>
+            </w:tcMar>
+          </w:tcPr>
+          <w:p>
+            <w:pPr>
+              <w:spacing w:after="0"/>
+            </w:pPr>
+            <w:r>
+              <w:rPr>
+                <w:color w:val="0D1B2A"/>
+              </w:rPr>
+              <w:t xml:space="preserve">An ARB quorum can provide the enterprise sign-off when delegated.</w:t>
+            </w:r>
+          </w:p>
+        </w:tc>
+      </w:tr>
+      <w:tr>
+        <w:tc>
+          <w:tcPr>
+            <w:tcW w:type="auto" w:w="100"/>
+            <w:tcBorders>
+              <w:top w:val="single" w:color="D9D5CD" w:sz="2"/>
+              <w:left w:val="single" w:color="D9D5CD" w:sz="2"/>
+              <w:bottom w:val="single" w:color="D9D5CD" w:sz="2"/>
+              <w:right w:val="single" w:color="D9D5CD" w:sz="2"/>
+            </w:tcBorders>
+            <w:tcMar>
+              <w:top w:type="dxa" w:w="60"/>
+              <w:left w:type="dxa" w:w="90"/>
+              <w:bottom w:type="dxa" w:w="60"/>
+              <w:right w:type="dxa" w:w="90"/>
+            </w:tcMar>
+          </w:tcPr>
+          <w:p>
+            <w:pPr>
+              <w:spacing w:after="0"/>
+            </w:pPr>
+            <w:r>
+              <w:rPr>
+                <w:color w:val="0D1B2A"/>
+              </w:rPr>
+              <w:t xml:space="preserve">FR-FG-012</w:t>
+            </w:r>
+          </w:p>
+        </w:tc>
+        <w:tc>
+          <w:tcPr>
+            <w:tcW w:type="auto" w:w="100"/>
+            <w:tcBorders>
+              <w:top w:val="single" w:color="D9D5CD" w:sz="2"/>
+              <w:left w:val="single" w:color="D9D5CD" w:sz="2"/>
+              <w:bottom w:val="single" w:color="D9D5CD" w:sz="2"/>
+              <w:right w:val="single" w:color="D9D5CD" w:sz="2"/>
+            </w:tcBorders>
+            <w:tcMar>
+              <w:top w:type="dxa" w:w="60"/>
+              <w:left w:type="dxa" w:w="90"/>
+              <w:bottom w:type="dxa" w:w="60"/>
+              <w:right w:type="dxa" w:w="90"/>
+            </w:tcMar>
+          </w:tcPr>
+          <w:p>
+            <w:pPr>
+              <w:spacing w:after="0"/>
+            </w:pPr>
+            <w:r>
+              <w:rPr>
+                <w:color w:val="0D1B2A"/>
+              </w:rPr>
+              <w:t xml:space="preserve">M</w:t>
+            </w:r>
+          </w:p>
+        </w:tc>
+        <w:tc>
+          <w:tcPr>
+            <w:tcW w:type="auto" w:w="100"/>
+            <w:tcBorders>
+              <w:top w:val="single" w:color="D9D5CD" w:sz="2"/>
+              <w:left w:val="single" w:color="D9D5CD" w:sz="2"/>
+              <w:bottom w:val="single" w:color="D9D5CD" w:sz="2"/>
+              <w:right w:val="single" w:color="D9D5CD" w:sz="2"/>
+            </w:tcBorders>
+            <w:tcMar>
+              <w:top w:type="dxa" w:w="60"/>
+              <w:left w:type="dxa" w:w="90"/>
+              <w:bottom w:type="dxa" w:w="60"/>
+              <w:right w:type="dxa" w:w="90"/>
+            </w:tcMar>
+          </w:tcPr>
+          <w:p>
+            <w:pPr>
+              <w:spacing w:after="0"/>
+            </w:pPr>
+            <w:r>
+              <w:rPr>
+                <w:b/>
+                <w:bCs/>
+                <w:color w:val="0D1B2A"/>
+              </w:rPr>
+              <w:t xml:space="preserve">Domain Steward / Owner</w:t>
+            </w:r>
+            <w:r>
+              <w:rPr>
+                <w:color w:val="0D1B2A"/>
+              </w:rPr>
+              <w:t xml:space="preserve"> roles SHALL be </w:t>
+            </w:r>
+            <w:r>
+              <w:rPr>
+                <w:b/>
+                <w:bCs/>
+                <w:color w:val="0D1B2A"/>
+              </w:rPr>
+              <w:t xml:space="preserve">domain-scoped</w:t>
+            </w:r>
+            <w:r>
+              <w:rPr>
+                <w:color w:val="0D1B2A"/>
+              </w:rPr>
+              <w:t xml:space="preserve">: a steward approves only within their domain.</w:t>
+            </w:r>
+          </w:p>
+        </w:tc>
+        <w:tc>
+          <w:tcPr>
+            <w:tcW w:type="auto" w:w="100"/>
+            <w:tcBorders>
+              <w:top w:val="single" w:color="D9D5CD" w:sz="2"/>
+              <w:left w:val="single" w:color="D9D5CD" w:sz="2"/>
+              <w:bottom w:val="single" w:color="D9D5CD" w:sz="2"/>
+              <w:right w:val="single" w:color="D9D5CD" w:sz="2"/>
+            </w:tcBorders>
+            <w:tcMar>
+              <w:top w:type="dxa" w:w="60"/>
+              <w:left w:type="dxa" w:w="90"/>
+              <w:bottom w:type="dxa" w:w="60"/>
+              <w:right w:type="dxa" w:w="90"/>
+            </w:tcMar>
+          </w:tcPr>
+          <w:p>
+            <w:pPr>
+              <w:spacing w:after="0"/>
+            </w:pPr>
+            <w:r>
+              <w:rPr>
+                <w:color w:val="0D1B2A"/>
+              </w:rPr>
+              <w:t xml:space="preserve">A steward cannot approve changes outside their domain.</w:t>
+            </w:r>
+          </w:p>
+        </w:tc>
+      </w:tr>
+      <w:tr>
+        <w:tc>
+          <w:tcPr>
+            <w:tcW w:type="auto" w:w="100"/>
+            <w:tcBorders>
+              <w:top w:val="single" w:color="D9D5CD" w:sz="2"/>
+              <w:left w:val="single" w:color="D9D5CD" w:sz="2"/>
+              <w:bottom w:val="single" w:color="D9D5CD" w:sz="2"/>
+              <w:right w:val="single" w:color="D9D5CD" w:sz="2"/>
+            </w:tcBorders>
+            <w:shd w:color="F1EFE9" w:val="solid"/>
+            <w:tcMar>
+              <w:top w:type="dxa" w:w="60"/>
+              <w:left w:type="dxa" w:w="90"/>
+              <w:bottom w:type="dxa" w:w="60"/>
+              <w:right w:type="dxa" w:w="90"/>
+            </w:tcMar>
+          </w:tcPr>
+          <w:p>
+            <w:pPr>
+              <w:spacing w:after="0"/>
+            </w:pPr>
+            <w:r>
+              <w:rPr>
+                <w:color w:val="0D1B2A"/>
+              </w:rPr>
+              <w:t xml:space="preserve">FR-FG-013</w:t>
+            </w:r>
+          </w:p>
+        </w:tc>
+        <w:tc>
+          <w:tcPr>
+            <w:tcW w:type="auto" w:w="100"/>
+            <w:tcBorders>
+              <w:top w:val="single" w:color="D9D5CD" w:sz="2"/>
+              <w:left w:val="single" w:color="D9D5CD" w:sz="2"/>
+              <w:bottom w:val="single" w:color="D9D5CD" w:sz="2"/>
+              <w:right w:val="single" w:color="D9D5CD" w:sz="2"/>
+            </w:tcBorders>
+            <w:shd w:color="F1EFE9" w:val="solid"/>
+            <w:tcMar>
+              <w:top w:type="dxa" w:w="60"/>
+              <w:left w:type="dxa" w:w="90"/>
+              <w:bottom w:type="dxa" w:w="60"/>
+              <w:right w:type="dxa" w:w="90"/>
+            </w:tcMar>
+          </w:tcPr>
+          <w:p>
+            <w:pPr>
+              <w:spacing w:after="0"/>
+            </w:pPr>
+            <w:r>
+              <w:rPr>
+                <w:color w:val="0D1B2A"/>
+              </w:rPr>
+              <w:t xml:space="preserve">M</w:t>
+            </w:r>
+          </w:p>
+        </w:tc>
+        <w:tc>
+          <w:tcPr>
+            <w:tcW w:type="auto" w:w="100"/>
+            <w:tcBorders>
+              <w:top w:val="single" w:color="D9D5CD" w:sz="2"/>
+              <w:left w:val="single" w:color="D9D5CD" w:sz="2"/>
+              <w:bottom w:val="single" w:color="D9D5CD" w:sz="2"/>
+              <w:right w:val="single" w:color="D9D5CD" w:sz="2"/>
+            </w:tcBorders>
+            <w:shd w:color="F1EFE9" w:val="solid"/>
+            <w:tcMar>
+              <w:top w:type="dxa" w:w="60"/>
+              <w:left w:type="dxa" w:w="90"/>
+              <w:bottom w:type="dxa" w:w="60"/>
+              <w:right w:type="dxa" w:w="90"/>
+            </w:tcMar>
+          </w:tcPr>
+          <w:p>
+            <w:pPr>
+              <w:spacing w:after="0"/>
+            </w:pPr>
+            <w:r>
+              <w:rPr>
+                <w:color w:val="0D1B2A"/>
+              </w:rPr>
+              <w:t xml:space="preserve">Segregation of duties SHALL apply at </w:t>
+            </w:r>
+            <w:r>
+              <w:rPr>
+                <w:b/>
+                <w:bCs/>
+                <w:color w:val="0D1B2A"/>
+              </w:rPr>
+              <w:t xml:space="preserve">every tier</w:t>
+            </w:r>
+            <w:r>
+              <w:rPr>
+                <w:color w:val="0D1B2A"/>
+              </w:rPr>
+              <w:t xml:space="preserve">: the proposer cannot provide domain approval or CDA sign-off for the same change.</w:t>
+            </w:r>
+          </w:p>
+        </w:tc>
+        <w:tc>
+          <w:tcPr>
+            <w:tcW w:type="auto" w:w="100"/>
+            <w:tcBorders>
+              <w:top w:val="single" w:color="D9D5CD" w:sz="2"/>
+              <w:left w:val="single" w:color="D9D5CD" w:sz="2"/>
+              <w:bottom w:val="single" w:color="D9D5CD" w:sz="2"/>
+              <w:right w:val="single" w:color="D9D5CD" w:sz="2"/>
+            </w:tcBorders>
+            <w:shd w:color="F1EFE9" w:val="solid"/>
+            <w:tcMar>
+              <w:top w:type="dxa" w:w="60"/>
+              <w:left w:type="dxa" w:w="90"/>
+              <w:bottom w:type="dxa" w:w="60"/>
+              <w:right w:type="dxa" w:w="90"/>
+            </w:tcMar>
+          </w:tcPr>
+          <w:p>
+            <w:pPr>
+              <w:spacing w:after="0"/>
+            </w:pPr>
+            <w:r>
+              <w:rPr>
+                <w:color w:val="0D1B2A"/>
+              </w:rPr>
+              <w:t xml:space="preserve">Self-approval at any tier is rejected.</w:t>
+            </w:r>
+          </w:p>
+        </w:tc>
+      </w:tr>
+    </w:tbl>
+    <w:p>
+      <w:pPr>
+        <w:spacing w:after="120"/>
+      </w:pPr>
+    </w:p>
+    <w:p>
+      <w:pPr>
+        <w:pStyle w:val="Heading2"/>
+        <w:spacing w:after="80" w:before="220"/>
+      </w:pPr>
+      <w:r>
+        <w:rPr>
+          <w:b/>
+          <w:bCs/>
+          <w:color w:val="15756B"/>
+        </w:rPr>
+        <w:t xml:space="preserve">7.3 Approval routing &amp; enterprise sign-off</w:t>
+      </w:r>
+    </w:p>
+    <w:tbl>
+      <w:tblPr>
+        <w:tblW w:type="pct" w:w="100%"/>
+        <w:tblBorders>
+          <w:top w:val="single" w:color="D9D5CD" w:sz="2"/>
+          <w:left w:val="single" w:color="D9D5CD" w:sz="2"/>
+          <w:bottom w:val="single" w:color="D9D5CD" w:sz="2"/>
+          <w:right w:val="single" w:color="D9D5CD" w:sz="2"/>
+          <w:insideH w:val="single" w:color="auto" w:sz="4"/>
+          <w:insideV w:val="single" w:color="auto" w:sz="4"/>
+        </w:tblBorders>
+      </w:tblPr>
+      <w:tblGrid>
+        <w:gridCol w:w="100"/>
+        <w:gridCol w:w="100"/>
+        <w:gridCol w:w="100"/>
+        <w:gridCol w:w="100"/>
+      </w:tblGrid>
+      <w:tr>
+        <w:trPr>
+          <w:tblHeader/>
+        </w:trPr>
+        <w:tc>
+          <w:tcPr>
+            <w:tcW w:type="auto" w:w="100"/>
+            <w:tcBorders>
+              <w:top w:val="single" w:color="D9D5CD" w:sz="2"/>
+              <w:left w:val="single" w:color="D9D5CD" w:sz="2"/>
+              <w:bottom w:val="single" w:color="D9D5CD" w:sz="2"/>
+              <w:right w:val="single" w:color="D9D5CD" w:sz="2"/>
+            </w:tcBorders>
+            <w:shd w:color="0D1B2A" w:val="solid"/>
+            <w:tcMar>
+              <w:top w:type="dxa" w:w="60"/>
+              <w:left w:type="dxa" w:w="90"/>
+              <w:bottom w:type="dxa" w:w="60"/>
+              <w:right w:type="dxa" w:w="90"/>
+            </w:tcMar>
+          </w:tcPr>
+          <w:p>
+            <w:pPr>
+              <w:spacing w:after="0"/>
+            </w:pPr>
+            <w:r>
+              <w:rPr>
+                <w:b/>
+                <w:bCs/>
+                <w:color w:val="FFFFFF"/>
+              </w:rPr>
+              <w:t xml:space="preserve">ID</w:t>
+            </w:r>
+          </w:p>
+        </w:tc>
+        <w:tc>
+          <w:tcPr>
+            <w:tcW w:type="auto" w:w="100"/>
+            <w:tcBorders>
+              <w:top w:val="single" w:color="D9D5CD" w:sz="2"/>
+              <w:left w:val="single" w:color="D9D5CD" w:sz="2"/>
+              <w:bottom w:val="single" w:color="D9D5CD" w:sz="2"/>
+              <w:right w:val="single" w:color="D9D5CD" w:sz="2"/>
+            </w:tcBorders>
+            <w:shd w:color="0D1B2A" w:val="solid"/>
+            <w:tcMar>
+              <w:top w:type="dxa" w:w="60"/>
+              <w:left w:type="dxa" w:w="90"/>
+              <w:bottom w:type="dxa" w:w="60"/>
+              <w:right w:type="dxa" w:w="90"/>
+            </w:tcMar>
+          </w:tcPr>
+          <w:p>
+            <w:pPr>
+              <w:spacing w:after="0"/>
+            </w:pPr>
+            <w:r>
+              <w:rPr>
+                <w:b/>
+                <w:bCs/>
+                <w:color w:val="FFFFFF"/>
+              </w:rPr>
+              <w:t xml:space="preserve">Pri</w:t>
+            </w:r>
+          </w:p>
+        </w:tc>
+        <w:tc>
+          <w:tcPr>
+            <w:tcW w:type="auto" w:w="100"/>
+            <w:tcBorders>
+              <w:top w:val="single" w:color="D9D5CD" w:sz="2"/>
+              <w:left w:val="single" w:color="D9D5CD" w:sz="2"/>
+              <w:bottom w:val="single" w:color="D9D5CD" w:sz="2"/>
+              <w:right w:val="single" w:color="D9D5CD" w:sz="2"/>
+            </w:tcBorders>
+            <w:shd w:color="0D1B2A" w:val="solid"/>
+            <w:tcMar>
+              <w:top w:type="dxa" w:w="60"/>
+              <w:left w:type="dxa" w:w="90"/>
+              <w:bottom w:type="dxa" w:w="60"/>
+              <w:right w:type="dxa" w:w="90"/>
+            </w:tcMar>
+          </w:tcPr>
+          <w:p>
+            <w:pPr>
+              <w:spacing w:after="0"/>
+            </w:pPr>
+            <w:r>
+              <w:rPr>
+                <w:b/>
+                <w:bCs/>
+                <w:color w:val="FFFFFF"/>
+              </w:rPr>
+              <w:t xml:space="preserve">Requirement</w:t>
+            </w:r>
+          </w:p>
+        </w:tc>
+        <w:tc>
+          <w:tcPr>
+            <w:tcW w:type="auto" w:w="100"/>
+            <w:tcBorders>
+              <w:top w:val="single" w:color="D9D5CD" w:sz="2"/>
+              <w:left w:val="single" w:color="D9D5CD" w:sz="2"/>
+              <w:bottom w:val="single" w:color="D9D5CD" w:sz="2"/>
+              <w:right w:val="single" w:color="D9D5CD" w:sz="2"/>
+            </w:tcBorders>
+            <w:shd w:color="0D1B2A" w:val="solid"/>
+            <w:tcMar>
+              <w:top w:type="dxa" w:w="60"/>
+              <w:left w:type="dxa" w:w="90"/>
+              <w:bottom w:type="dxa" w:w="60"/>
+              <w:right w:type="dxa" w:w="90"/>
+            </w:tcMar>
+          </w:tcPr>
+          <w:p>
+            <w:pPr>
+              <w:spacing w:after="0"/>
+            </w:pPr>
+            <w:r>
+              <w:rPr>
+                <w:b/>
+                <w:bCs/>
+                <w:color w:val="FFFFFF"/>
+              </w:rPr>
+              <w:t xml:space="preserve">Acceptance criteria</w:t>
+            </w:r>
+          </w:p>
+        </w:tc>
+      </w:tr>
+      <w:tr>
+        <w:tc>
+          <w:tcPr>
+            <w:tcW w:type="auto" w:w="100"/>
+            <w:tcBorders>
+              <w:top w:val="single" w:color="D9D5CD" w:sz="2"/>
+              <w:left w:val="single" w:color="D9D5CD" w:sz="2"/>
+              <w:bottom w:val="single" w:color="D9D5CD" w:sz="2"/>
+              <w:right w:val="single" w:color="D9D5CD" w:sz="2"/>
+            </w:tcBorders>
+            <w:tcMar>
+              <w:top w:type="dxa" w:w="60"/>
+              <w:left w:type="dxa" w:w="90"/>
+              <w:bottom w:type="dxa" w:w="60"/>
+              <w:right w:type="dxa" w:w="90"/>
+            </w:tcMar>
+          </w:tcPr>
+          <w:p>
+            <w:pPr>
+              <w:spacing w:after="0"/>
+            </w:pPr>
+            <w:r>
+              <w:rPr>
+                <w:color w:val="0D1B2A"/>
+              </w:rPr>
+              <w:t xml:space="preserve">FR-FG-020</w:t>
+            </w:r>
+          </w:p>
+        </w:tc>
+        <w:tc>
+          <w:tcPr>
+            <w:tcW w:type="auto" w:w="100"/>
+            <w:tcBorders>
+              <w:top w:val="single" w:color="D9D5CD" w:sz="2"/>
+              <w:left w:val="single" w:color="D9D5CD" w:sz="2"/>
+              <w:bottom w:val="single" w:color="D9D5CD" w:sz="2"/>
+              <w:right w:val="single" w:color="D9D5CD" w:sz="2"/>
+            </w:tcBorders>
+            <w:tcMar>
+              <w:top w:type="dxa" w:w="60"/>
+              <w:left w:type="dxa" w:w="90"/>
+              <w:bottom w:type="dxa" w:w="60"/>
+              <w:right w:type="dxa" w:w="90"/>
+            </w:tcMar>
+          </w:tcPr>
+          <w:p>
+            <w:pPr>
+              <w:spacing w:after="0"/>
+            </w:pPr>
+            <w:r>
+              <w:rPr>
+                <w:color w:val="0D1B2A"/>
+              </w:rPr>
+              <w:t xml:space="preserve">M</w:t>
+            </w:r>
+          </w:p>
+        </w:tc>
+        <w:tc>
+          <w:tcPr>
+            <w:tcW w:type="auto" w:w="100"/>
+            <w:tcBorders>
+              <w:top w:val="single" w:color="D9D5CD" w:sz="2"/>
+              <w:left w:val="single" w:color="D9D5CD" w:sz="2"/>
+              <w:bottom w:val="single" w:color="D9D5CD" w:sz="2"/>
+              <w:right w:val="single" w:color="D9D5CD" w:sz="2"/>
+            </w:tcBorders>
+            <w:tcMar>
+              <w:top w:type="dxa" w:w="60"/>
+              <w:left w:type="dxa" w:w="90"/>
+              <w:bottom w:type="dxa" w:w="60"/>
+              <w:right w:type="dxa" w:w="90"/>
+            </w:tcMar>
+          </w:tcPr>
+          <w:p>
+            <w:pPr>
+              <w:spacing w:after="0"/>
+            </w:pPr>
+            <w:r>
+              <w:rPr>
+                <w:color w:val="0D1B2A"/>
+              </w:rPr>
+              <w:t xml:space="preserve">The system SHALL compute required approvals from a </w:t>
+            </w:r>
+            <w:r>
+              <w:rPr>
+                <w:b/>
+                <w:bCs/>
+                <w:color w:val="0D1B2A"/>
+              </w:rPr>
+              <w:t xml:space="preserve">configurable routing policy</w:t>
+            </w:r>
+            <w:r>
+              <w:rPr>
+                <w:color w:val="0D1B2A"/>
+              </w:rPr>
+              <w:t xml:space="preserve"> over change attributes (model kind, severity, scope, classification delta, cross-domain).</w:t>
+            </w:r>
+          </w:p>
+        </w:tc>
+        <w:tc>
+          <w:tcPr>
+            <w:tcW w:type="auto" w:w="100"/>
+            <w:tcBorders>
+              <w:top w:val="single" w:color="D9D5CD" w:sz="2"/>
+              <w:left w:val="single" w:color="D9D5CD" w:sz="2"/>
+              <w:bottom w:val="single" w:color="D9D5CD" w:sz="2"/>
+              <w:right w:val="single" w:color="D9D5CD" w:sz="2"/>
+            </w:tcBorders>
+            <w:tcMar>
+              <w:top w:type="dxa" w:w="60"/>
+              <w:left w:type="dxa" w:w="90"/>
+              <w:bottom w:type="dxa" w:w="60"/>
+              <w:right w:type="dxa" w:w="90"/>
+            </w:tcMar>
+          </w:tcPr>
+          <w:p>
+            <w:pPr>
+              <w:spacing w:after="0"/>
+            </w:pPr>
+            <w:r>
+              <w:rPr>
+                <w:color w:val="0D1B2A"/>
+              </w:rPr>
+              <w:t xml:space="preserve">Changing the policy changes the required approvers without code changes.</w:t>
+            </w:r>
+          </w:p>
+        </w:tc>
+      </w:tr>
+      <w:tr>
+        <w:tc>
+          <w:tcPr>
+            <w:tcW w:type="auto" w:w="100"/>
+            <w:tcBorders>
+              <w:top w:val="single" w:color="D9D5CD" w:sz="2"/>
+              <w:left w:val="single" w:color="D9D5CD" w:sz="2"/>
+              <w:bottom w:val="single" w:color="D9D5CD" w:sz="2"/>
+              <w:right w:val="single" w:color="D9D5CD" w:sz="2"/>
+            </w:tcBorders>
+            <w:shd w:color="F1EFE9" w:val="solid"/>
+            <w:tcMar>
+              <w:top w:type="dxa" w:w="60"/>
+              <w:left w:type="dxa" w:w="90"/>
+              <w:bottom w:type="dxa" w:w="60"/>
+              <w:right w:type="dxa" w:w="90"/>
+            </w:tcMar>
+          </w:tcPr>
+          <w:p>
+            <w:pPr>
+              <w:spacing w:after="0"/>
+            </w:pPr>
+            <w:r>
+              <w:rPr>
+                <w:color w:val="0D1B2A"/>
+              </w:rPr>
+              <w:t xml:space="preserve">FR-FG-021</w:t>
+            </w:r>
+          </w:p>
+        </w:tc>
+        <w:tc>
+          <w:tcPr>
+            <w:tcW w:type="auto" w:w="100"/>
+            <w:tcBorders>
+              <w:top w:val="single" w:color="D9D5CD" w:sz="2"/>
+              <w:left w:val="single" w:color="D9D5CD" w:sz="2"/>
+              <w:bottom w:val="single" w:color="D9D5CD" w:sz="2"/>
+              <w:right w:val="single" w:color="D9D5CD" w:sz="2"/>
+            </w:tcBorders>
+            <w:shd w:color="F1EFE9" w:val="solid"/>
+            <w:tcMar>
+              <w:top w:type="dxa" w:w="60"/>
+              <w:left w:type="dxa" w:w="90"/>
+              <w:bottom w:type="dxa" w:w="60"/>
+              <w:right w:type="dxa" w:w="90"/>
+            </w:tcMar>
+          </w:tcPr>
+          <w:p>
+            <w:pPr>
+              <w:spacing w:after="0"/>
+            </w:pPr>
+            <w:r>
+              <w:rPr>
+                <w:color w:val="0D1B2A"/>
+              </w:rPr>
+              <w:t xml:space="preserve">M</w:t>
+            </w:r>
+          </w:p>
+        </w:tc>
+        <w:tc>
+          <w:tcPr>
+            <w:tcW w:type="auto" w:w="100"/>
+            <w:tcBorders>
+              <w:top w:val="single" w:color="D9D5CD" w:sz="2"/>
+              <w:left w:val="single" w:color="D9D5CD" w:sz="2"/>
+              <w:bottom w:val="single" w:color="D9D5CD" w:sz="2"/>
+              <w:right w:val="single" w:color="D9D5CD" w:sz="2"/>
+            </w:tcBorders>
+            <w:shd w:color="F1EFE9" w:val="solid"/>
+            <w:tcMar>
+              <w:top w:type="dxa" w:w="60"/>
+              <w:left w:type="dxa" w:w="90"/>
+              <w:bottom w:type="dxa" w:w="60"/>
+              <w:right w:type="dxa" w:w="90"/>
+            </w:tcMar>
+          </w:tcPr>
+          <w:p>
+            <w:pPr>
+              <w:spacing w:after="0"/>
+            </w:pPr>
+            <w:r>
+              <w:rPr>
+                <w:color w:val="0D1B2A"/>
+              </w:rPr>
+              <w:t xml:space="preserve">The routing policy SHALL require </w:t>
+            </w:r>
+            <w:r>
+              <w:rPr>
+                <w:b/>
+                <w:bCs/>
+                <w:color w:val="0D1B2A"/>
+              </w:rPr>
+              <w:t xml:space="preserve">CDA sign-off</w:t>
+            </w:r>
+            <w:r>
+              <w:rPr>
+                <w:color w:val="0D1B2A"/>
+              </w:rPr>
+              <w:t xml:space="preserve"> by default when a change: touches a </w:t>
+            </w:r>
+            <w:r>
+              <w:rPr>
+                <w:b/>
+                <w:bCs/>
+                <w:color w:val="0D1B2A"/>
+              </w:rPr>
+              <w:t xml:space="preserve">BDM</w:t>
+            </w:r>
+            <w:r>
+              <w:rPr>
+                <w:color w:val="0D1B2A"/>
+              </w:rPr>
+              <w:t xml:space="preserve">, is </w:t>
+            </w:r>
+            <w:r>
+              <w:rPr>
+                <w:b/>
+                <w:bCs/>
+                <w:color w:val="0D1B2A"/>
+              </w:rPr>
+              <w:t xml:space="preserve">breaking/major</w:t>
+            </w:r>
+            <w:r>
+              <w:rPr>
+                <w:color w:val="0D1B2A"/>
+              </w:rPr>
+              <w:t xml:space="preserve">, adds/changes a </w:t>
+            </w:r>
+            <w:r>
+              <w:rPr>
+                <w:b/>
+                <w:bCs/>
+                <w:color w:val="0D1B2A"/>
+              </w:rPr>
+              <w:t xml:space="preserve">cross-domain</w:t>
+            </w:r>
+            <w:r>
+              <w:rPr>
+                <w:color w:val="0D1B2A"/>
+              </w:rPr>
+              <w:t xml:space="preserve"> reference, introduces a </w:t>
+            </w:r>
+            <w:r>
+              <w:rPr>
+                <w:b/>
+                <w:bCs/>
+                <w:color w:val="0D1B2A"/>
+              </w:rPr>
+              <w:t xml:space="preserve">new entity</w:t>
+            </w:r>
+            <w:r>
+              <w:rPr>
+                <w:color w:val="0D1B2A"/>
+              </w:rPr>
+              <w:t xml:space="preserve">, alters </w:t>
+            </w:r>
+            <w:r>
+              <w:rPr>
+                <w:b/>
+                <w:bCs/>
+                <w:color w:val="0D1B2A"/>
+              </w:rPr>
+              <w:t xml:space="preserve">classification</w:t>
+            </w:r>
+            <w:r>
+              <w:rPr>
+                <w:color w:val="0D1B2A"/>
+              </w:rPr>
+              <w:t xml:space="preserve">, or affects a </w:t>
+            </w:r>
+            <w:r>
+              <w:rPr>
+                <w:b/>
+                <w:bCs/>
+                <w:color w:val="0D1B2A"/>
+              </w:rPr>
+              <w:t xml:space="preserve">shared/enterprise</w:t>
+            </w:r>
+            <w:r>
+              <w:rPr>
+                <w:color w:val="0D1B2A"/>
+              </w:rPr>
+              <w:t xml:space="preserve"> model.</w:t>
+            </w:r>
+          </w:p>
+        </w:tc>
+        <w:tc>
+          <w:tcPr>
+            <w:tcW w:type="auto" w:w="100"/>
+            <w:tcBorders>
+              <w:top w:val="single" w:color="D9D5CD" w:sz="2"/>
+              <w:left w:val="single" w:color="D9D5CD" w:sz="2"/>
+              <w:bottom w:val="single" w:color="D9D5CD" w:sz="2"/>
+              <w:right w:val="single" w:color="D9D5CD" w:sz="2"/>
+            </w:tcBorders>
+            <w:shd w:color="F1EFE9" w:val="solid"/>
+            <w:tcMar>
+              <w:top w:type="dxa" w:w="60"/>
+              <w:left w:type="dxa" w:w="90"/>
+              <w:bottom w:type="dxa" w:w="60"/>
+              <w:right w:type="dxa" w:w="90"/>
+            </w:tcMar>
+          </w:tcPr>
+          <w:p>
+            <w:pPr>
+              <w:spacing w:after="0"/>
+            </w:pPr>
+            <w:r>
+              <w:rPr>
+                <w:color w:val="0D1B2A"/>
+              </w:rPr>
+              <w:t xml:space="preserve">Each listed condition triggers a required CDA sign-off; others do not.</w:t>
+            </w:r>
+          </w:p>
+        </w:tc>
+      </w:tr>
+      <w:tr>
+        <w:tc>
+          <w:tcPr>
+            <w:tcW w:type="auto" w:w="100"/>
+            <w:tcBorders>
+              <w:top w:val="single" w:color="D9D5CD" w:sz="2"/>
+              <w:left w:val="single" w:color="D9D5CD" w:sz="2"/>
+              <w:bottom w:val="single" w:color="D9D5CD" w:sz="2"/>
+              <w:right w:val="single" w:color="D9D5CD" w:sz="2"/>
+            </w:tcBorders>
+            <w:tcMar>
+              <w:top w:type="dxa" w:w="60"/>
+              <w:left w:type="dxa" w:w="90"/>
+              <w:bottom w:type="dxa" w:w="60"/>
+              <w:right w:type="dxa" w:w="90"/>
+            </w:tcMar>
+          </w:tcPr>
+          <w:p>
+            <w:pPr>
+              <w:spacing w:after="0"/>
+            </w:pPr>
+            <w:r>
+              <w:rPr>
+                <w:color w:val="0D1B2A"/>
+              </w:rPr>
+              <w:t xml:space="preserve">FR-FG-022</w:t>
+            </w:r>
+          </w:p>
+        </w:tc>
+        <w:tc>
+          <w:tcPr>
+            <w:tcW w:type="auto" w:w="100"/>
+            <w:tcBorders>
+              <w:top w:val="single" w:color="D9D5CD" w:sz="2"/>
+              <w:left w:val="single" w:color="D9D5CD" w:sz="2"/>
+              <w:bottom w:val="single" w:color="D9D5CD" w:sz="2"/>
+              <w:right w:val="single" w:color="D9D5CD" w:sz="2"/>
+            </w:tcBorders>
+            <w:tcMar>
+              <w:top w:type="dxa" w:w="60"/>
+              <w:left w:type="dxa" w:w="90"/>
+              <w:bottom w:type="dxa" w:w="60"/>
+              <w:right w:type="dxa" w:w="90"/>
+            </w:tcMar>
+          </w:tcPr>
+          <w:p>
+            <w:pPr>
+              <w:spacing w:after="0"/>
+            </w:pPr>
+            <w:r>
+              <w:rPr>
+                <w:color w:val="0D1B2A"/>
+              </w:rPr>
+              <w:t xml:space="preserve">M</w:t>
+            </w:r>
+          </w:p>
+        </w:tc>
+        <w:tc>
+          <w:tcPr>
+            <w:tcW w:type="auto" w:w="100"/>
+            <w:tcBorders>
+              <w:top w:val="single" w:color="D9D5CD" w:sz="2"/>
+              <w:left w:val="single" w:color="D9D5CD" w:sz="2"/>
+              <w:bottom w:val="single" w:color="D9D5CD" w:sz="2"/>
+              <w:right w:val="single" w:color="D9D5CD" w:sz="2"/>
+            </w:tcBorders>
+            <w:tcMar>
+              <w:top w:type="dxa" w:w="60"/>
+              <w:left w:type="dxa" w:w="90"/>
+              <w:bottom w:type="dxa" w:w="60"/>
+              <w:right w:type="dxa" w:w="90"/>
+            </w:tcMar>
+          </w:tcPr>
+          <w:p>
+            <w:pPr>
+              <w:spacing w:after="0"/>
+            </w:pPr>
+            <w:r>
+              <w:rPr>
+                <w:color w:val="0D1B2A"/>
+              </w:rPr>
+              <w:t xml:space="preserve">Routine, in-domain change (PDM tuning, docs, minor additive) SHALL be </w:t>
+            </w:r>
+            <w:r>
+              <w:rPr>
+                <w:b/>
+                <w:bCs/>
+                <w:color w:val="0D1B2A"/>
+              </w:rPr>
+              <w:t xml:space="preserve">approvable at the domain tier alone</w:t>
+            </w:r>
+            <w:r>
+              <w:rPr>
+                <w:color w:val="0D1B2A"/>
+              </w:rPr>
+              <w:t xml:space="preserve"> (autonomy within guardrails).</w:t>
+            </w:r>
+          </w:p>
+        </w:tc>
+        <w:tc>
+          <w:tcPr>
+            <w:tcW w:type="auto" w:w="100"/>
+            <w:tcBorders>
+              <w:top w:val="single" w:color="D9D5CD" w:sz="2"/>
+              <w:left w:val="single" w:color="D9D5CD" w:sz="2"/>
+              <w:bottom w:val="single" w:color="D9D5CD" w:sz="2"/>
+              <w:right w:val="single" w:color="D9D5CD" w:sz="2"/>
+            </w:tcBorders>
+            <w:tcMar>
+              <w:top w:type="dxa" w:w="60"/>
+              <w:left w:type="dxa" w:w="90"/>
+              <w:bottom w:type="dxa" w:w="60"/>
+              <w:right w:type="dxa" w:w="90"/>
+            </w:tcMar>
+          </w:tcPr>
+          <w:p>
+            <w:pPr>
+              <w:spacing w:after="0"/>
+            </w:pPr>
+            <w:r>
+              <w:rPr>
+                <w:color w:val="0D1B2A"/>
+              </w:rPr>
+              <w:t xml:space="preserve">An in-domain patch merges with domain approval only.</w:t>
+            </w:r>
+          </w:p>
+        </w:tc>
+      </w:tr>
+      <w:tr>
+        <w:tc>
+          <w:tcPr>
+            <w:tcW w:type="auto" w:w="100"/>
+            <w:tcBorders>
+              <w:top w:val="single" w:color="D9D5CD" w:sz="2"/>
+              <w:left w:val="single" w:color="D9D5CD" w:sz="2"/>
+              <w:bottom w:val="single" w:color="D9D5CD" w:sz="2"/>
+              <w:right w:val="single" w:color="D9D5CD" w:sz="2"/>
+            </w:tcBorders>
+            <w:shd w:color="F1EFE9" w:val="solid"/>
+            <w:tcMar>
+              <w:top w:type="dxa" w:w="60"/>
+              <w:left w:type="dxa" w:w="90"/>
+              <w:bottom w:type="dxa" w:w="60"/>
+              <w:right w:type="dxa" w:w="90"/>
+            </w:tcMar>
+          </w:tcPr>
+          <w:p>
+            <w:pPr>
+              <w:spacing w:after="0"/>
+            </w:pPr>
+            <w:r>
+              <w:rPr>
+                <w:color w:val="0D1B2A"/>
+              </w:rPr>
+              <w:t xml:space="preserve">FR-FG-023</w:t>
+            </w:r>
+          </w:p>
+        </w:tc>
+        <w:tc>
+          <w:tcPr>
+            <w:tcW w:type="auto" w:w="100"/>
+            <w:tcBorders>
+              <w:top w:val="single" w:color="D9D5CD" w:sz="2"/>
+              <w:left w:val="single" w:color="D9D5CD" w:sz="2"/>
+              <w:bottom w:val="single" w:color="D9D5CD" w:sz="2"/>
+              <w:right w:val="single" w:color="D9D5CD" w:sz="2"/>
+            </w:tcBorders>
+            <w:shd w:color="F1EFE9" w:val="solid"/>
+            <w:tcMar>
+              <w:top w:type="dxa" w:w="60"/>
+              <w:left w:type="dxa" w:w="90"/>
+              <w:bottom w:type="dxa" w:w="60"/>
+              <w:right w:type="dxa" w:w="90"/>
+            </w:tcMar>
+          </w:tcPr>
+          <w:p>
+            <w:pPr>
+              <w:spacing w:after="0"/>
+            </w:pPr>
+            <w:r>
+              <w:rPr>
+                <w:color w:val="0D1B2A"/>
+              </w:rPr>
+              <w:t xml:space="preserve">M</w:t>
+            </w:r>
+          </w:p>
+        </w:tc>
+        <w:tc>
+          <w:tcPr>
+            <w:tcW w:type="auto" w:w="100"/>
+            <w:tcBorders>
+              <w:top w:val="single" w:color="D9D5CD" w:sz="2"/>
+              <w:left w:val="single" w:color="D9D5CD" w:sz="2"/>
+              <w:bottom w:val="single" w:color="D9D5CD" w:sz="2"/>
+              <w:right w:val="single" w:color="D9D5CD" w:sz="2"/>
+            </w:tcBorders>
+            <w:shd w:color="F1EFE9" w:val="solid"/>
+            <w:tcMar>
+              <w:top w:type="dxa" w:w="60"/>
+              <w:left w:type="dxa" w:w="90"/>
+              <w:bottom w:type="dxa" w:w="60"/>
+              <w:right w:type="dxa" w:w="90"/>
+            </w:tcMar>
+          </w:tcPr>
+          <w:p>
+            <w:pPr>
+              <w:spacing w:after="0"/>
+            </w:pPr>
+            <w:r>
+              <w:rPr>
+                <w:color w:val="0D1B2A"/>
+              </w:rPr>
+              <w:t xml:space="preserve">A ChangeSet requiring enterprise sign-off SHALL </w:t>
+            </w:r>
+            <w:r>
+              <w:rPr>
+                <w:b/>
+                <w:bCs/>
+                <w:color w:val="0D1B2A"/>
+              </w:rPr>
+              <w:t xml:space="preserve">escalate to the CDA review queue</w:t>
+            </w:r>
+            <w:r>
+              <w:rPr>
+                <w:color w:val="0D1B2A"/>
+              </w:rPr>
+              <w:t xml:space="preserve"> after domain approval and SHALL NOT merge until signed off.</w:t>
+            </w:r>
+          </w:p>
+        </w:tc>
+        <w:tc>
+          <w:tcPr>
+            <w:tcW w:type="auto" w:w="100"/>
+            <w:tcBorders>
+              <w:top w:val="single" w:color="D9D5CD" w:sz="2"/>
+              <w:left w:val="single" w:color="D9D5CD" w:sz="2"/>
+              <w:bottom w:val="single" w:color="D9D5CD" w:sz="2"/>
+              <w:right w:val="single" w:color="D9D5CD" w:sz="2"/>
+            </w:tcBorders>
+            <w:shd w:color="F1EFE9" w:val="solid"/>
+            <w:tcMar>
+              <w:top w:type="dxa" w:w="60"/>
+              <w:left w:type="dxa" w:w="90"/>
+              <w:bottom w:type="dxa" w:w="60"/>
+              <w:right w:type="dxa" w:w="90"/>
+            </w:tcMar>
+          </w:tcPr>
+          <w:p>
+            <w:pPr>
+              <w:spacing w:after="0"/>
+            </w:pPr>
+            <w:r>
+              <w:rPr>
+                <w:color w:val="0D1B2A"/>
+              </w:rPr>
+              <w:t xml:space="preserve">The change cannot merge without the CDA sign-off recorded.</w:t>
+            </w:r>
+          </w:p>
+        </w:tc>
+      </w:tr>
+      <w:tr>
+        <w:tc>
+          <w:tcPr>
+            <w:tcW w:type="auto" w:w="100"/>
+            <w:tcBorders>
+              <w:top w:val="single" w:color="D9D5CD" w:sz="2"/>
+              <w:left w:val="single" w:color="D9D5CD" w:sz="2"/>
+              <w:bottom w:val="single" w:color="D9D5CD" w:sz="2"/>
+              <w:right w:val="single" w:color="D9D5CD" w:sz="2"/>
+            </w:tcBorders>
+            <w:tcMar>
+              <w:top w:type="dxa" w:w="60"/>
+              <w:left w:type="dxa" w:w="90"/>
+              <w:bottom w:type="dxa" w:w="60"/>
+              <w:right w:type="dxa" w:w="90"/>
+            </w:tcMar>
+          </w:tcPr>
+          <w:p>
+            <w:pPr>
+              <w:spacing w:after="0"/>
+            </w:pPr>
+            <w:r>
+              <w:rPr>
+                <w:color w:val="0D1B2A"/>
+              </w:rPr>
+              <w:t xml:space="preserve">FR-FG-024</w:t>
+            </w:r>
+          </w:p>
+        </w:tc>
+        <w:tc>
+          <w:tcPr>
+            <w:tcW w:type="auto" w:w="100"/>
+            <w:tcBorders>
+              <w:top w:val="single" w:color="D9D5CD" w:sz="2"/>
+              <w:left w:val="single" w:color="D9D5CD" w:sz="2"/>
+              <w:bottom w:val="single" w:color="D9D5CD" w:sz="2"/>
+              <w:right w:val="single" w:color="D9D5CD" w:sz="2"/>
+            </w:tcBorders>
+            <w:tcMar>
+              <w:top w:type="dxa" w:w="60"/>
+              <w:left w:type="dxa" w:w="90"/>
+              <w:bottom w:type="dxa" w:w="60"/>
+              <w:right w:type="dxa" w:w="90"/>
+            </w:tcMar>
+          </w:tcPr>
+          <w:p>
+            <w:pPr>
+              <w:spacing w:after="0"/>
+            </w:pPr>
+            <w:r>
+              <w:rPr>
+                <w:color w:val="0D1B2A"/>
+              </w:rPr>
+              <w:t xml:space="preserve">M</w:t>
+            </w:r>
+          </w:p>
+        </w:tc>
+        <w:tc>
+          <w:tcPr>
+            <w:tcW w:type="auto" w:w="100"/>
+            <w:tcBorders>
+              <w:top w:val="single" w:color="D9D5CD" w:sz="2"/>
+              <w:left w:val="single" w:color="D9D5CD" w:sz="2"/>
+              <w:bottom w:val="single" w:color="D9D5CD" w:sz="2"/>
+              <w:right w:val="single" w:color="D9D5CD" w:sz="2"/>
+            </w:tcBorders>
+            <w:tcMar>
+              <w:top w:type="dxa" w:w="60"/>
+              <w:left w:type="dxa" w:w="90"/>
+              <w:bottom w:type="dxa" w:w="60"/>
+              <w:right w:type="dxa" w:w="90"/>
+            </w:tcMar>
+          </w:tcPr>
+          <w:p>
+            <w:pPr>
+              <w:spacing w:after="0"/>
+            </w:pPr>
+            <w:r>
+              <w:rPr>
+                <w:color w:val="0D1B2A"/>
+              </w:rPr>
+              <w:t xml:space="preserve">The system SHALL provide a </w:t>
+            </w:r>
+            <w:r>
+              <w:rPr>
+                <w:b/>
+                <w:bCs/>
+                <w:color w:val="0D1B2A"/>
+              </w:rPr>
+              <w:t xml:space="preserve">CDA review queue / dashboard</w:t>
+            </w:r>
+            <w:r>
+              <w:rPr>
+                <w:color w:val="0D1B2A"/>
+              </w:rPr>
+              <w:t xml:space="preserve"> showing pending enterprise sign-offs across all domains, with change scope, impact, and gate status.</w:t>
+            </w:r>
+          </w:p>
+        </w:tc>
+        <w:tc>
+          <w:tcPr>
+            <w:tcW w:type="auto" w:w="100"/>
+            <w:tcBorders>
+              <w:top w:val="single" w:color="D9D5CD" w:sz="2"/>
+              <w:left w:val="single" w:color="D9D5CD" w:sz="2"/>
+              <w:bottom w:val="single" w:color="D9D5CD" w:sz="2"/>
+              <w:right w:val="single" w:color="D9D5CD" w:sz="2"/>
+            </w:tcBorders>
+            <w:tcMar>
+              <w:top w:type="dxa" w:w="60"/>
+              <w:left w:type="dxa" w:w="90"/>
+              <w:bottom w:type="dxa" w:w="60"/>
+              <w:right w:type="dxa" w:w="90"/>
+            </w:tcMar>
+          </w:tcPr>
+          <w:p>
+            <w:pPr>
+              <w:spacing w:after="0"/>
+            </w:pPr>
+            <w:r>
+              <w:rPr>
+                <w:color w:val="0D1B2A"/>
+              </w:rPr>
+              <w:t xml:space="preserve">The CDA sees all pending enterprise approvals in one place.</w:t>
+            </w:r>
+          </w:p>
+        </w:tc>
+      </w:tr>
+      <w:tr>
+        <w:tc>
+          <w:tcPr>
+            <w:tcW w:type="auto" w:w="100"/>
+            <w:tcBorders>
+              <w:top w:val="single" w:color="D9D5CD" w:sz="2"/>
+              <w:left w:val="single" w:color="D9D5CD" w:sz="2"/>
+              <w:bottom w:val="single" w:color="D9D5CD" w:sz="2"/>
+              <w:right w:val="single" w:color="D9D5CD" w:sz="2"/>
+            </w:tcBorders>
+            <w:shd w:color="F1EFE9" w:val="solid"/>
+            <w:tcMar>
+              <w:top w:type="dxa" w:w="60"/>
+              <w:left w:type="dxa" w:w="90"/>
+              <w:bottom w:type="dxa" w:w="60"/>
+              <w:right w:type="dxa" w:w="90"/>
+            </w:tcMar>
+          </w:tcPr>
+          <w:p>
+            <w:pPr>
+              <w:spacing w:after="0"/>
+            </w:pPr>
+            <w:r>
+              <w:rPr>
+                <w:color w:val="0D1B2A"/>
+              </w:rPr>
+              <w:t xml:space="preserve">FR-FG-025</w:t>
+            </w:r>
+          </w:p>
+        </w:tc>
+        <w:tc>
+          <w:tcPr>
+            <w:tcW w:type="auto" w:w="100"/>
+            <w:tcBorders>
+              <w:top w:val="single" w:color="D9D5CD" w:sz="2"/>
+              <w:left w:val="single" w:color="D9D5CD" w:sz="2"/>
+              <w:bottom w:val="single" w:color="D9D5CD" w:sz="2"/>
+              <w:right w:val="single" w:color="D9D5CD" w:sz="2"/>
+            </w:tcBorders>
+            <w:shd w:color="F1EFE9" w:val="solid"/>
+            <w:tcMar>
+              <w:top w:type="dxa" w:w="60"/>
+              <w:left w:type="dxa" w:w="90"/>
+              <w:bottom w:type="dxa" w:w="60"/>
+              <w:right w:type="dxa" w:w="90"/>
+            </w:tcMar>
+          </w:tcPr>
+          <w:p>
+            <w:pPr>
+              <w:spacing w:after="0"/>
+            </w:pPr>
+            <w:r>
+              <w:rPr>
+                <w:color w:val="0D1B2A"/>
+              </w:rPr>
+              <w:t xml:space="preserve">S</w:t>
+            </w:r>
+          </w:p>
+        </w:tc>
+        <w:tc>
+          <w:tcPr>
+            <w:tcW w:type="auto" w:w="100"/>
+            <w:tcBorders>
+              <w:top w:val="single" w:color="D9D5CD" w:sz="2"/>
+              <w:left w:val="single" w:color="D9D5CD" w:sz="2"/>
+              <w:bottom w:val="single" w:color="D9D5CD" w:sz="2"/>
+              <w:right w:val="single" w:color="D9D5CD" w:sz="2"/>
+            </w:tcBorders>
+            <w:shd w:color="F1EFE9" w:val="solid"/>
+            <w:tcMar>
+              <w:top w:type="dxa" w:w="60"/>
+              <w:left w:type="dxa" w:w="90"/>
+              <w:bottom w:type="dxa" w:w="60"/>
+              <w:right w:type="dxa" w:w="90"/>
+            </w:tcMar>
+          </w:tcPr>
+          <w:p>
+            <w:pPr>
+              <w:spacing w:after="0"/>
+            </w:pPr>
+            <w:r>
+              <w:rPr>
+                <w:color w:val="0D1B2A"/>
+              </w:rPr>
+              <w:t xml:space="preserve">The system SHALL apply </w:t>
+            </w:r>
+            <w:r>
+              <w:rPr>
+                <w:b/>
+                <w:bCs/>
+                <w:color w:val="0D1B2A"/>
+              </w:rPr>
+              <w:t xml:space="preserve">review SLAs</w:t>
+            </w:r>
+            <w:r>
+              <w:rPr>
+                <w:color w:val="0D1B2A"/>
+              </w:rPr>
+              <w:t xml:space="preserve"> per tier and </w:t>
+            </w:r>
+            <w:r>
+              <w:rPr>
+                <w:b/>
+                <w:bCs/>
+                <w:color w:val="0D1B2A"/>
+              </w:rPr>
+              <w:t xml:space="preserve">escalate</w:t>
+            </w:r>
+            <w:r>
+              <w:rPr>
+                <w:color w:val="0D1B2A"/>
+              </w:rPr>
+              <w:t xml:space="preserve"> stale enterprise sign-offs (reminder → ARB → delegate).</w:t>
+            </w:r>
+          </w:p>
+        </w:tc>
+        <w:tc>
+          <w:tcPr>
+            <w:tcW w:type="auto" w:w="100"/>
+            <w:tcBorders>
+              <w:top w:val="single" w:color="D9D5CD" w:sz="2"/>
+              <w:left w:val="single" w:color="D9D5CD" w:sz="2"/>
+              <w:bottom w:val="single" w:color="D9D5CD" w:sz="2"/>
+              <w:right w:val="single" w:color="D9D5CD" w:sz="2"/>
+            </w:tcBorders>
+            <w:shd w:color="F1EFE9" w:val="solid"/>
+            <w:tcMar>
+              <w:top w:type="dxa" w:w="60"/>
+              <w:left w:type="dxa" w:w="90"/>
+              <w:bottom w:type="dxa" w:w="60"/>
+              <w:right w:type="dxa" w:w="90"/>
+            </w:tcMar>
+          </w:tcPr>
+          <w:p>
+            <w:pPr>
+              <w:spacing w:after="0"/>
+            </w:pPr>
+            <w:r>
+              <w:rPr>
+                <w:color w:val="0D1B2A"/>
+              </w:rPr>
+              <w:t xml:space="preserve">A stale sign-off triggers escalation per policy.</w:t>
+            </w:r>
+          </w:p>
+        </w:tc>
+      </w:tr>
+      <w:tr>
+        <w:tc>
+          <w:tcPr>
+            <w:tcW w:type="auto" w:w="100"/>
+            <w:tcBorders>
+              <w:top w:val="single" w:color="D9D5CD" w:sz="2"/>
+              <w:left w:val="single" w:color="D9D5CD" w:sz="2"/>
+              <w:bottom w:val="single" w:color="D9D5CD" w:sz="2"/>
+              <w:right w:val="single" w:color="D9D5CD" w:sz="2"/>
+            </w:tcBorders>
+            <w:tcMar>
+              <w:top w:type="dxa" w:w="60"/>
+              <w:left w:type="dxa" w:w="90"/>
+              <w:bottom w:type="dxa" w:w="60"/>
+              <w:right w:type="dxa" w:w="90"/>
+            </w:tcMar>
+          </w:tcPr>
+          <w:p>
+            <w:pPr>
+              <w:spacing w:after="0"/>
+            </w:pPr>
+            <w:r>
+              <w:rPr>
+                <w:color w:val="0D1B2A"/>
+              </w:rPr>
+              <w:t xml:space="preserve">FR-FG-026</w:t>
+            </w:r>
+          </w:p>
+        </w:tc>
+        <w:tc>
+          <w:tcPr>
+            <w:tcW w:type="auto" w:w="100"/>
+            <w:tcBorders>
+              <w:top w:val="single" w:color="D9D5CD" w:sz="2"/>
+              <w:left w:val="single" w:color="D9D5CD" w:sz="2"/>
+              <w:bottom w:val="single" w:color="D9D5CD" w:sz="2"/>
+              <w:right w:val="single" w:color="D9D5CD" w:sz="2"/>
+            </w:tcBorders>
+            <w:tcMar>
+              <w:top w:type="dxa" w:w="60"/>
+              <w:left w:type="dxa" w:w="90"/>
+              <w:bottom w:type="dxa" w:w="60"/>
+              <w:right w:type="dxa" w:w="90"/>
+            </w:tcMar>
+          </w:tcPr>
+          <w:p>
+            <w:pPr>
+              <w:spacing w:after="0"/>
+            </w:pPr>
+            <w:r>
+              <w:rPr>
+                <w:color w:val="0D1B2A"/>
+              </w:rPr>
+              <w:t xml:space="preserve">C</w:t>
+            </w:r>
+          </w:p>
+        </w:tc>
+        <w:tc>
+          <w:tcPr>
+            <w:tcW w:type="auto" w:w="100"/>
+            <w:tcBorders>
+              <w:top w:val="single" w:color="D9D5CD" w:sz="2"/>
+              <w:left w:val="single" w:color="D9D5CD" w:sz="2"/>
+              <w:bottom w:val="single" w:color="D9D5CD" w:sz="2"/>
+              <w:right w:val="single" w:color="D9D5CD" w:sz="2"/>
+            </w:tcBorders>
+            <w:tcMar>
+              <w:top w:type="dxa" w:w="60"/>
+              <w:left w:type="dxa" w:w="90"/>
+              <w:bottom w:type="dxa" w:w="60"/>
+              <w:right w:type="dxa" w:w="90"/>
+            </w:tcMar>
+          </w:tcPr>
+          <w:p>
+            <w:pPr>
+              <w:spacing w:after="0"/>
+            </w:pPr>
+            <w:r>
+              <w:rPr>
+                <w:color w:val="0D1B2A"/>
+              </w:rPr>
+              <w:t xml:space="preserve">The CDA SHALL be able to </w:t>
+            </w:r>
+            <w:r>
+              <w:rPr>
+                <w:b/>
+                <w:bCs/>
+                <w:color w:val="0D1B2A"/>
+              </w:rPr>
+              <w:t xml:space="preserve">delegate</w:t>
+            </w:r>
+            <w:r>
+              <w:rPr>
+                <w:color w:val="0D1B2A"/>
+              </w:rPr>
+              <w:t xml:space="preserve"> specified change classes to the domain tier (graduated autonomy), recorded and audited.</w:t>
+            </w:r>
+          </w:p>
+        </w:tc>
+        <w:tc>
+          <w:tcPr>
+            <w:tcW w:type="auto" w:w="100"/>
+            <w:tcBorders>
+              <w:top w:val="single" w:color="D9D5CD" w:sz="2"/>
+              <w:left w:val="single" w:color="D9D5CD" w:sz="2"/>
+              <w:bottom w:val="single" w:color="D9D5CD" w:sz="2"/>
+              <w:right w:val="single" w:color="D9D5CD" w:sz="2"/>
+            </w:tcBorders>
+            <w:tcMar>
+              <w:top w:type="dxa" w:w="60"/>
+              <w:left w:type="dxa" w:w="90"/>
+              <w:bottom w:type="dxa" w:w="60"/>
+              <w:right w:type="dxa" w:w="90"/>
+            </w:tcMar>
+          </w:tcPr>
+          <w:p>
+            <w:pPr>
+              <w:spacing w:after="0"/>
+            </w:pPr>
+            <w:r>
+              <w:rPr>
+                <w:color w:val="0D1B2A"/>
+              </w:rPr>
+              <w:t xml:space="preserve">A delegated class no longer requires CDA sign-off after the policy change.</w:t>
+            </w:r>
+          </w:p>
+        </w:tc>
+      </w:tr>
+    </w:tbl>
+    <w:p>
+      <w:pPr>
+        <w:spacing w:after="120"/>
+      </w:pPr>
+    </w:p>
+    <w:p>
+      <w:pPr>
+        <w:pStyle w:val="Heading2"/>
+        <w:spacing w:after="80" w:before="220"/>
+      </w:pPr>
+      <w:r>
+        <w:rPr>
+          <w:b/>
+          <w:bCs/>
+          <w:color w:val="15756B"/>
+        </w:rPr>
+        <w:t xml:space="preserve">7.4 Enterprise standards as code</w:t>
+      </w:r>
+    </w:p>
+    <w:tbl>
+      <w:tblPr>
+        <w:tblW w:type="pct" w:w="100%"/>
+        <w:tblBorders>
+          <w:top w:val="single" w:color="D9D5CD" w:sz="2"/>
+          <w:left w:val="single" w:color="D9D5CD" w:sz="2"/>
+          <w:bottom w:val="single" w:color="D9D5CD" w:sz="2"/>
+          <w:right w:val="single" w:color="D9D5CD" w:sz="2"/>
+          <w:insideH w:val="single" w:color="auto" w:sz="4"/>
+          <w:insideV w:val="single" w:color="auto" w:sz="4"/>
+        </w:tblBorders>
+      </w:tblPr>
+      <w:tblGrid>
+        <w:gridCol w:w="100"/>
+        <w:gridCol w:w="100"/>
+        <w:gridCol w:w="100"/>
+        <w:gridCol w:w="100"/>
+      </w:tblGrid>
+      <w:tr>
+        <w:trPr>
+          <w:tblHeader/>
+        </w:trPr>
+        <w:tc>
+          <w:tcPr>
+            <w:tcW w:type="auto" w:w="100"/>
+            <w:tcBorders>
+              <w:top w:val="single" w:color="D9D5CD" w:sz="2"/>
+              <w:left w:val="single" w:color="D9D5CD" w:sz="2"/>
+              <w:bottom w:val="single" w:color="D9D5CD" w:sz="2"/>
+              <w:right w:val="single" w:color="D9D5CD" w:sz="2"/>
+            </w:tcBorders>
+            <w:shd w:color="0D1B2A" w:val="solid"/>
+            <w:tcMar>
+              <w:top w:type="dxa" w:w="60"/>
+              <w:left w:type="dxa" w:w="90"/>
+              <w:bottom w:type="dxa" w:w="60"/>
+              <w:right w:type="dxa" w:w="90"/>
+            </w:tcMar>
+          </w:tcPr>
+          <w:p>
+            <w:pPr>
+              <w:spacing w:after="0"/>
+            </w:pPr>
+            <w:r>
+              <w:rPr>
+                <w:b/>
+                <w:bCs/>
+                <w:color w:val="FFFFFF"/>
+              </w:rPr>
+              <w:t xml:space="preserve">ID</w:t>
+            </w:r>
+          </w:p>
+        </w:tc>
+        <w:tc>
+          <w:tcPr>
+            <w:tcW w:type="auto" w:w="100"/>
+            <w:tcBorders>
+              <w:top w:val="single" w:color="D9D5CD" w:sz="2"/>
+              <w:left w:val="single" w:color="D9D5CD" w:sz="2"/>
+              <w:bottom w:val="single" w:color="D9D5CD" w:sz="2"/>
+              <w:right w:val="single" w:color="D9D5CD" w:sz="2"/>
+            </w:tcBorders>
+            <w:shd w:color="0D1B2A" w:val="solid"/>
+            <w:tcMar>
+              <w:top w:type="dxa" w:w="60"/>
+              <w:left w:type="dxa" w:w="90"/>
+              <w:bottom w:type="dxa" w:w="60"/>
+              <w:right w:type="dxa" w:w="90"/>
+            </w:tcMar>
+          </w:tcPr>
+          <w:p>
+            <w:pPr>
+              <w:spacing w:after="0"/>
+            </w:pPr>
+            <w:r>
+              <w:rPr>
+                <w:b/>
+                <w:bCs/>
+                <w:color w:val="FFFFFF"/>
+              </w:rPr>
+              <w:t xml:space="preserve">Pri</w:t>
+            </w:r>
+          </w:p>
+        </w:tc>
+        <w:tc>
+          <w:tcPr>
+            <w:tcW w:type="auto" w:w="100"/>
+            <w:tcBorders>
+              <w:top w:val="single" w:color="D9D5CD" w:sz="2"/>
+              <w:left w:val="single" w:color="D9D5CD" w:sz="2"/>
+              <w:bottom w:val="single" w:color="D9D5CD" w:sz="2"/>
+              <w:right w:val="single" w:color="D9D5CD" w:sz="2"/>
+            </w:tcBorders>
+            <w:shd w:color="0D1B2A" w:val="solid"/>
+            <w:tcMar>
+              <w:top w:type="dxa" w:w="60"/>
+              <w:left w:type="dxa" w:w="90"/>
+              <w:bottom w:type="dxa" w:w="60"/>
+              <w:right w:type="dxa" w:w="90"/>
+            </w:tcMar>
+          </w:tcPr>
+          <w:p>
+            <w:pPr>
+              <w:spacing w:after="0"/>
+            </w:pPr>
+            <w:r>
+              <w:rPr>
+                <w:b/>
+                <w:bCs/>
+                <w:color w:val="FFFFFF"/>
+              </w:rPr>
+              <w:t xml:space="preserve">Requirement</w:t>
+            </w:r>
+          </w:p>
+        </w:tc>
+        <w:tc>
+          <w:tcPr>
+            <w:tcW w:type="auto" w:w="100"/>
+            <w:tcBorders>
+              <w:top w:val="single" w:color="D9D5CD" w:sz="2"/>
+              <w:left w:val="single" w:color="D9D5CD" w:sz="2"/>
+              <w:bottom w:val="single" w:color="D9D5CD" w:sz="2"/>
+              <w:right w:val="single" w:color="D9D5CD" w:sz="2"/>
+            </w:tcBorders>
+            <w:shd w:color="0D1B2A" w:val="solid"/>
+            <w:tcMar>
+              <w:top w:type="dxa" w:w="60"/>
+              <w:left w:type="dxa" w:w="90"/>
+              <w:bottom w:type="dxa" w:w="60"/>
+              <w:right w:type="dxa" w:w="90"/>
+            </w:tcMar>
+          </w:tcPr>
+          <w:p>
+            <w:pPr>
+              <w:spacing w:after="0"/>
+            </w:pPr>
+            <w:r>
+              <w:rPr>
+                <w:b/>
+                <w:bCs/>
+                <w:color w:val="FFFFFF"/>
+              </w:rPr>
+              <w:t xml:space="preserve">Acceptance criteria</w:t>
+            </w:r>
+          </w:p>
+        </w:tc>
+      </w:tr>
+      <w:tr>
+        <w:tc>
+          <w:tcPr>
+            <w:tcW w:type="auto" w:w="100"/>
+            <w:tcBorders>
+              <w:top w:val="single" w:color="D9D5CD" w:sz="2"/>
+              <w:left w:val="single" w:color="D9D5CD" w:sz="2"/>
+              <w:bottom w:val="single" w:color="D9D5CD" w:sz="2"/>
+              <w:right w:val="single" w:color="D9D5CD" w:sz="2"/>
+            </w:tcBorders>
+            <w:tcMar>
+              <w:top w:type="dxa" w:w="60"/>
+              <w:left w:type="dxa" w:w="90"/>
+              <w:bottom w:type="dxa" w:w="60"/>
+              <w:right w:type="dxa" w:w="90"/>
+            </w:tcMar>
+          </w:tcPr>
+          <w:p>
+            <w:pPr>
+              <w:spacing w:after="0"/>
+            </w:pPr>
+            <w:r>
+              <w:rPr>
+                <w:color w:val="0D1B2A"/>
+              </w:rPr>
+              <w:t xml:space="preserve">FR-FG-030</w:t>
+            </w:r>
+          </w:p>
+        </w:tc>
+        <w:tc>
+          <w:tcPr>
+            <w:tcW w:type="auto" w:w="100"/>
+            <w:tcBorders>
+              <w:top w:val="single" w:color="D9D5CD" w:sz="2"/>
+              <w:left w:val="single" w:color="D9D5CD" w:sz="2"/>
+              <w:bottom w:val="single" w:color="D9D5CD" w:sz="2"/>
+              <w:right w:val="single" w:color="D9D5CD" w:sz="2"/>
+            </w:tcBorders>
+            <w:tcMar>
+              <w:top w:type="dxa" w:w="60"/>
+              <w:left w:type="dxa" w:w="90"/>
+              <w:bottom w:type="dxa" w:w="60"/>
+              <w:right w:type="dxa" w:w="90"/>
+            </w:tcMar>
+          </w:tcPr>
+          <w:p>
+            <w:pPr>
+              <w:spacing w:after="0"/>
+            </w:pPr>
+            <w:r>
+              <w:rPr>
+                <w:color w:val="0D1B2A"/>
+              </w:rPr>
+              <w:t xml:space="preserve">M</w:t>
+            </w:r>
+          </w:p>
+        </w:tc>
+        <w:tc>
+          <w:tcPr>
+            <w:tcW w:type="auto" w:w="100"/>
+            <w:tcBorders>
+              <w:top w:val="single" w:color="D9D5CD" w:sz="2"/>
+              <w:left w:val="single" w:color="D9D5CD" w:sz="2"/>
+              <w:bottom w:val="single" w:color="D9D5CD" w:sz="2"/>
+              <w:right w:val="single" w:color="D9D5CD" w:sz="2"/>
+            </w:tcBorders>
+            <w:tcMar>
+              <w:top w:type="dxa" w:w="60"/>
+              <w:left w:type="dxa" w:w="90"/>
+              <w:bottom w:type="dxa" w:w="60"/>
+              <w:right w:type="dxa" w:w="90"/>
+            </w:tcMar>
+          </w:tcPr>
+          <w:p>
+            <w:pPr>
+              <w:spacing w:after="0"/>
+            </w:pPr>
+            <w:r>
+              <w:rPr>
+                <w:color w:val="0D1B2A"/>
+              </w:rPr>
+              <w:t xml:space="preserve">Enterprise modeling </w:t>
+            </w:r>
+            <w:r>
+              <w:rPr>
+                <w:b/>
+                <w:bCs/>
+                <w:color w:val="0D1B2A"/>
+              </w:rPr>
+              <w:t xml:space="preserve">standards</w:t>
+            </w:r>
+            <w:r>
+              <w:rPr>
+                <w:color w:val="0D1B2A"/>
+              </w:rPr>
+              <w:t xml:space="preserve"> SHALL be enforced as </w:t>
+            </w:r>
+            <w:r>
+              <w:rPr>
+                <w:b/>
+                <w:bCs/>
+                <w:color w:val="0D1B2A"/>
+              </w:rPr>
+              <w:t xml:space="preserve">automated gates</w:t>
+            </w:r>
+            <w:r>
+              <w:rPr>
+                <w:color w:val="0D1B2A"/>
+              </w:rPr>
+              <w:t xml:space="preserve"> (naming, classification coverage, semver discipline, cross-domain integrity) in both the ChangeSet pipeline and the models-repo CI.</w:t>
+            </w:r>
+          </w:p>
+        </w:tc>
+        <w:tc>
+          <w:tcPr>
+            <w:tcW w:type="auto" w:w="100"/>
+            <w:tcBorders>
+              <w:top w:val="single" w:color="D9D5CD" w:sz="2"/>
+              <w:left w:val="single" w:color="D9D5CD" w:sz="2"/>
+              <w:bottom w:val="single" w:color="D9D5CD" w:sz="2"/>
+              <w:right w:val="single" w:color="D9D5CD" w:sz="2"/>
+            </w:tcBorders>
+            <w:tcMar>
+              <w:top w:type="dxa" w:w="60"/>
+              <w:left w:type="dxa" w:w="90"/>
+              <w:bottom w:type="dxa" w:w="60"/>
+              <w:right w:type="dxa" w:w="90"/>
+            </w:tcMar>
+          </w:tcPr>
+          <w:p>
+            <w:pPr>
+              <w:spacing w:after="0"/>
+            </w:pPr>
+            <w:r>
+              <w:rPr>
+                <w:color w:val="0D1B2A"/>
+              </w:rPr>
+              <w:t xml:space="preserve">Non-compliant change fails the relevant gate with detail.</w:t>
+            </w:r>
+          </w:p>
+        </w:tc>
+      </w:tr>
+      <w:tr>
+        <w:tc>
+          <w:tcPr>
+            <w:tcW w:type="auto" w:w="100"/>
+            <w:tcBorders>
+              <w:top w:val="single" w:color="D9D5CD" w:sz="2"/>
+              <w:left w:val="single" w:color="D9D5CD" w:sz="2"/>
+              <w:bottom w:val="single" w:color="D9D5CD" w:sz="2"/>
+              <w:right w:val="single" w:color="D9D5CD" w:sz="2"/>
+            </w:tcBorders>
+            <w:shd w:color="F1EFE9" w:val="solid"/>
+            <w:tcMar>
+              <w:top w:type="dxa" w:w="60"/>
+              <w:left w:type="dxa" w:w="90"/>
+              <w:bottom w:type="dxa" w:w="60"/>
+              <w:right w:type="dxa" w:w="90"/>
+            </w:tcMar>
+          </w:tcPr>
+          <w:p>
+            <w:pPr>
+              <w:spacing w:after="0"/>
+            </w:pPr>
+            <w:r>
+              <w:rPr>
+                <w:color w:val="0D1B2A"/>
+              </w:rPr>
+              <w:t xml:space="preserve">FR-FG-031</w:t>
+            </w:r>
+          </w:p>
+        </w:tc>
+        <w:tc>
+          <w:tcPr>
+            <w:tcW w:type="auto" w:w="100"/>
+            <w:tcBorders>
+              <w:top w:val="single" w:color="D9D5CD" w:sz="2"/>
+              <w:left w:val="single" w:color="D9D5CD" w:sz="2"/>
+              <w:bottom w:val="single" w:color="D9D5CD" w:sz="2"/>
+              <w:right w:val="single" w:color="D9D5CD" w:sz="2"/>
+            </w:tcBorders>
+            <w:shd w:color="F1EFE9" w:val="solid"/>
+            <w:tcMar>
+              <w:top w:type="dxa" w:w="60"/>
+              <w:left w:type="dxa" w:w="90"/>
+              <w:bottom w:type="dxa" w:w="60"/>
+              <w:right w:type="dxa" w:w="90"/>
+            </w:tcMar>
+          </w:tcPr>
+          <w:p>
+            <w:pPr>
+              <w:spacing w:after="0"/>
+            </w:pPr>
+            <w:r>
+              <w:rPr>
+                <w:color w:val="0D1B2A"/>
+              </w:rPr>
+              <w:t xml:space="preserve">S</w:t>
+            </w:r>
+          </w:p>
+        </w:tc>
+        <w:tc>
+          <w:tcPr>
+            <w:tcW w:type="auto" w:w="100"/>
+            <w:tcBorders>
+              <w:top w:val="single" w:color="D9D5CD" w:sz="2"/>
+              <w:left w:val="single" w:color="D9D5CD" w:sz="2"/>
+              <w:bottom w:val="single" w:color="D9D5CD" w:sz="2"/>
+              <w:right w:val="single" w:color="D9D5CD" w:sz="2"/>
+            </w:tcBorders>
+            <w:shd w:color="F1EFE9" w:val="solid"/>
+            <w:tcMar>
+              <w:top w:type="dxa" w:w="60"/>
+              <w:left w:type="dxa" w:w="90"/>
+              <w:bottom w:type="dxa" w:w="60"/>
+              <w:right w:type="dxa" w:w="90"/>
+            </w:tcMar>
+          </w:tcPr>
+          <w:p>
+            <w:pPr>
+              <w:spacing w:after="0"/>
+            </w:pPr>
+            <w:r>
+              <w:rPr>
+                <w:color w:val="0D1B2A"/>
+              </w:rPr>
+              <w:t xml:space="preserve">The system SHALL </w:t>
+            </w:r>
+            <w:r>
+              <w:rPr>
+                <w:b/>
+                <w:bCs/>
+                <w:color w:val="0D1B2A"/>
+              </w:rPr>
+              <w:t xml:space="preserve">flag duplication</w:t>
+            </w:r>
+            <w:r>
+              <w:rPr>
+                <w:color w:val="0D1B2A"/>
+              </w:rPr>
+              <w:t xml:space="preserve">: a new entity overlapping a conformed/shared model SHALL be surfaced for reuse before approval.</w:t>
+            </w:r>
+          </w:p>
+        </w:tc>
+        <w:tc>
+          <w:tcPr>
+            <w:tcW w:type="auto" w:w="100"/>
+            <w:tcBorders>
+              <w:top w:val="single" w:color="D9D5CD" w:sz="2"/>
+              <w:left w:val="single" w:color="D9D5CD" w:sz="2"/>
+              <w:bottom w:val="single" w:color="D9D5CD" w:sz="2"/>
+              <w:right w:val="single" w:color="D9D5CD" w:sz="2"/>
+            </w:tcBorders>
+            <w:shd w:color="F1EFE9" w:val="solid"/>
+            <w:tcMar>
+              <w:top w:type="dxa" w:w="60"/>
+              <w:left w:type="dxa" w:w="90"/>
+              <w:bottom w:type="dxa" w:w="60"/>
+              <w:right w:type="dxa" w:w="90"/>
+            </w:tcMar>
+          </w:tcPr>
+          <w:p>
+            <w:pPr>
+              <w:spacing w:after="0"/>
+            </w:pPr>
+            <w:r>
+              <w:rPr>
+                <w:color w:val="0D1B2A"/>
+              </w:rPr>
+              <w:t xml:space="preserve">A near-duplicate entity raises a reuse warning on the ChangeSet.</w:t>
+            </w:r>
+          </w:p>
+        </w:tc>
+      </w:tr>
+      <w:tr>
+        <w:tc>
+          <w:tcPr>
+            <w:tcW w:type="auto" w:w="100"/>
+            <w:tcBorders>
+              <w:top w:val="single" w:color="D9D5CD" w:sz="2"/>
+              <w:left w:val="single" w:color="D9D5CD" w:sz="2"/>
+              <w:bottom w:val="single" w:color="D9D5CD" w:sz="2"/>
+              <w:right w:val="single" w:color="D9D5CD" w:sz="2"/>
+            </w:tcBorders>
+            <w:tcMar>
+              <w:top w:type="dxa" w:w="60"/>
+              <w:left w:type="dxa" w:w="90"/>
+              <w:bottom w:type="dxa" w:w="60"/>
+              <w:right w:type="dxa" w:w="90"/>
+            </w:tcMar>
+          </w:tcPr>
+          <w:p>
+            <w:pPr>
+              <w:spacing w:after="0"/>
+            </w:pPr>
+            <w:r>
+              <w:rPr>
+                <w:color w:val="0D1B2A"/>
+              </w:rPr>
+              <w:t xml:space="preserve">FR-FG-032</w:t>
+            </w:r>
+          </w:p>
+        </w:tc>
+        <w:tc>
+          <w:tcPr>
+            <w:tcW w:type="auto" w:w="100"/>
+            <w:tcBorders>
+              <w:top w:val="single" w:color="D9D5CD" w:sz="2"/>
+              <w:left w:val="single" w:color="D9D5CD" w:sz="2"/>
+              <w:bottom w:val="single" w:color="D9D5CD" w:sz="2"/>
+              <w:right w:val="single" w:color="D9D5CD" w:sz="2"/>
+            </w:tcBorders>
+            <w:tcMar>
+              <w:top w:type="dxa" w:w="60"/>
+              <w:left w:type="dxa" w:w="90"/>
+              <w:bottom w:type="dxa" w:w="60"/>
+              <w:right w:type="dxa" w:w="90"/>
+            </w:tcMar>
+          </w:tcPr>
+          <w:p>
+            <w:pPr>
+              <w:spacing w:after="0"/>
+            </w:pPr>
+            <w:r>
+              <w:rPr>
+                <w:color w:val="0D1B2A"/>
+              </w:rPr>
+              <w:t xml:space="preserve">M</w:t>
+            </w:r>
+          </w:p>
+        </w:tc>
+        <w:tc>
+          <w:tcPr>
+            <w:tcW w:type="auto" w:w="100"/>
+            <w:tcBorders>
+              <w:top w:val="single" w:color="D9D5CD" w:sz="2"/>
+              <w:left w:val="single" w:color="D9D5CD" w:sz="2"/>
+              <w:bottom w:val="single" w:color="D9D5CD" w:sz="2"/>
+              <w:right w:val="single" w:color="D9D5CD" w:sz="2"/>
+            </w:tcBorders>
+            <w:tcMar>
+              <w:top w:type="dxa" w:w="60"/>
+              <w:left w:type="dxa" w:w="90"/>
+              <w:bottom w:type="dxa" w:w="60"/>
+              <w:right w:type="dxa" w:w="90"/>
+            </w:tcMar>
+          </w:tcPr>
+          <w:p>
+            <w:pPr>
+              <w:spacing w:after="0"/>
+            </w:pPr>
+            <w:r>
+              <w:rPr>
+                <w:color w:val="0D1B2A"/>
+              </w:rPr>
+              <w:t xml:space="preserve">Only the </w:t>
+            </w:r>
+            <w:r>
+              <w:rPr>
+                <w:b/>
+                <w:bCs/>
+                <w:color w:val="0D1B2A"/>
+              </w:rPr>
+              <w:t xml:space="preserve">CDA</w:t>
+            </w:r>
+            <w:r>
+              <w:rPr>
+                <w:color w:val="0D1B2A"/>
+              </w:rPr>
+              <w:t xml:space="preserve"> (or delegated ARB) SHALL be able to create or evolve </w:t>
+            </w:r>
+            <w:r>
+              <w:rPr>
+                <w:b/>
+                <w:bCs/>
+                <w:color w:val="0D1B2A"/>
+              </w:rPr>
+              <w:t xml:space="preserve">`shared`/`enterprise`-scope</w:t>
+            </w:r>
+            <w:r>
+              <w:rPr>
+                <w:color w:val="0D1B2A"/>
+              </w:rPr>
+              <w:t xml:space="preserve"> models (conformed-model protection).</w:t>
+            </w:r>
+          </w:p>
+        </w:tc>
+        <w:tc>
+          <w:tcPr>
+            <w:tcW w:type="auto" w:w="100"/>
+            <w:tcBorders>
+              <w:top w:val="single" w:color="D9D5CD" w:sz="2"/>
+              <w:left w:val="single" w:color="D9D5CD" w:sz="2"/>
+              <w:bottom w:val="single" w:color="D9D5CD" w:sz="2"/>
+              <w:right w:val="single" w:color="D9D5CD" w:sz="2"/>
+            </w:tcBorders>
+            <w:tcMar>
+              <w:top w:type="dxa" w:w="60"/>
+              <w:left w:type="dxa" w:w="90"/>
+              <w:bottom w:type="dxa" w:w="60"/>
+              <w:right w:type="dxa" w:w="90"/>
+            </w:tcMar>
+          </w:tcPr>
+          <w:p>
+            <w:pPr>
+              <w:spacing w:after="0"/>
+            </w:pPr>
+            <w:r>
+              <w:rPr>
+                <w:color w:val="0D1B2A"/>
+              </w:rPr>
+              <w:t xml:space="preserve">A domain steward cannot merge a change to a shared model without CDA sign-off.</w:t>
+            </w:r>
+          </w:p>
+        </w:tc>
+      </w:tr>
+    </w:tbl>
+    <w:p>
+      <w:pPr>
+        <w:spacing w:after="120"/>
+      </w:pPr>
+    </w:p>
+    <w:p>
+      <w:pPr>
+        <w:pStyle w:val="Heading2"/>
+        <w:spacing w:after="80" w:before="220"/>
+      </w:pPr>
+      <w:r>
+        <w:rPr>
+          <w:b/>
+          <w:bCs/>
+          <w:color w:val="15756B"/>
+        </w:rPr>
+        <w:t xml:space="preserve">7.5 Accountability</w:t>
+      </w:r>
+    </w:p>
+    <w:tbl>
+      <w:tblPr>
+        <w:tblW w:type="pct" w:w="100%"/>
+        <w:tblBorders>
+          <w:top w:val="single" w:color="D9D5CD" w:sz="2"/>
+          <w:left w:val="single" w:color="D9D5CD" w:sz="2"/>
+          <w:bottom w:val="single" w:color="D9D5CD" w:sz="2"/>
+          <w:right w:val="single" w:color="D9D5CD" w:sz="2"/>
+          <w:insideH w:val="single" w:color="auto" w:sz="4"/>
+          <w:insideV w:val="single" w:color="auto" w:sz="4"/>
+        </w:tblBorders>
+      </w:tblPr>
+      <w:tblGrid>
+        <w:gridCol w:w="100"/>
+        <w:gridCol w:w="100"/>
+        <w:gridCol w:w="100"/>
+        <w:gridCol w:w="100"/>
+      </w:tblGrid>
+      <w:tr>
+        <w:trPr>
+          <w:tblHeader/>
+        </w:trPr>
+        <w:tc>
+          <w:tcPr>
+            <w:tcW w:type="auto" w:w="100"/>
+            <w:tcBorders>
+              <w:top w:val="single" w:color="D9D5CD" w:sz="2"/>
+              <w:left w:val="single" w:color="D9D5CD" w:sz="2"/>
+              <w:bottom w:val="single" w:color="D9D5CD" w:sz="2"/>
+              <w:right w:val="single" w:color="D9D5CD" w:sz="2"/>
+            </w:tcBorders>
+            <w:shd w:color="0D1B2A" w:val="solid"/>
+            <w:tcMar>
+              <w:top w:type="dxa" w:w="60"/>
+              <w:left w:type="dxa" w:w="90"/>
+              <w:bottom w:type="dxa" w:w="60"/>
+              <w:right w:type="dxa" w:w="90"/>
+            </w:tcMar>
+          </w:tcPr>
+          <w:p>
+            <w:pPr>
+              <w:spacing w:after="0"/>
+            </w:pPr>
+            <w:r>
+              <w:rPr>
+                <w:b/>
+                <w:bCs/>
+                <w:color w:val="FFFFFF"/>
+              </w:rPr>
+              <w:t xml:space="preserve">ID</w:t>
+            </w:r>
+          </w:p>
+        </w:tc>
+        <w:tc>
+          <w:tcPr>
+            <w:tcW w:type="auto" w:w="100"/>
+            <w:tcBorders>
+              <w:top w:val="single" w:color="D9D5CD" w:sz="2"/>
+              <w:left w:val="single" w:color="D9D5CD" w:sz="2"/>
+              <w:bottom w:val="single" w:color="D9D5CD" w:sz="2"/>
+              <w:right w:val="single" w:color="D9D5CD" w:sz="2"/>
+            </w:tcBorders>
+            <w:shd w:color="0D1B2A" w:val="solid"/>
+            <w:tcMar>
+              <w:top w:type="dxa" w:w="60"/>
+              <w:left w:type="dxa" w:w="90"/>
+              <w:bottom w:type="dxa" w:w="60"/>
+              <w:right w:type="dxa" w:w="90"/>
+            </w:tcMar>
+          </w:tcPr>
+          <w:p>
+            <w:pPr>
+              <w:spacing w:after="0"/>
+            </w:pPr>
+            <w:r>
+              <w:rPr>
+                <w:b/>
+                <w:bCs/>
+                <w:color w:val="FFFFFF"/>
+              </w:rPr>
+              <w:t xml:space="preserve">Pri</w:t>
+            </w:r>
+          </w:p>
+        </w:tc>
+        <w:tc>
+          <w:tcPr>
+            <w:tcW w:type="auto" w:w="100"/>
+            <w:tcBorders>
+              <w:top w:val="single" w:color="D9D5CD" w:sz="2"/>
+              <w:left w:val="single" w:color="D9D5CD" w:sz="2"/>
+              <w:bottom w:val="single" w:color="D9D5CD" w:sz="2"/>
+              <w:right w:val="single" w:color="D9D5CD" w:sz="2"/>
+            </w:tcBorders>
+            <w:shd w:color="0D1B2A" w:val="solid"/>
+            <w:tcMar>
+              <w:top w:type="dxa" w:w="60"/>
+              <w:left w:type="dxa" w:w="90"/>
+              <w:bottom w:type="dxa" w:w="60"/>
+              <w:right w:type="dxa" w:w="90"/>
+            </w:tcMar>
+          </w:tcPr>
+          <w:p>
+            <w:pPr>
+              <w:spacing w:after="0"/>
+            </w:pPr>
+            <w:r>
+              <w:rPr>
+                <w:b/>
+                <w:bCs/>
+                <w:color w:val="FFFFFF"/>
+              </w:rPr>
+              <w:t xml:space="preserve">Requirement</w:t>
+            </w:r>
+          </w:p>
+        </w:tc>
+        <w:tc>
+          <w:tcPr>
+            <w:tcW w:type="auto" w:w="100"/>
+            <w:tcBorders>
+              <w:top w:val="single" w:color="D9D5CD" w:sz="2"/>
+              <w:left w:val="single" w:color="D9D5CD" w:sz="2"/>
+              <w:bottom w:val="single" w:color="D9D5CD" w:sz="2"/>
+              <w:right w:val="single" w:color="D9D5CD" w:sz="2"/>
+            </w:tcBorders>
+            <w:shd w:color="0D1B2A" w:val="solid"/>
+            <w:tcMar>
+              <w:top w:type="dxa" w:w="60"/>
+              <w:left w:type="dxa" w:w="90"/>
+              <w:bottom w:type="dxa" w:w="60"/>
+              <w:right w:type="dxa" w:w="90"/>
+            </w:tcMar>
+          </w:tcPr>
+          <w:p>
+            <w:pPr>
+              <w:spacing w:after="0"/>
+            </w:pPr>
+            <w:r>
+              <w:rPr>
+                <w:b/>
+                <w:bCs/>
+                <w:color w:val="FFFFFF"/>
+              </w:rPr>
+              <w:t xml:space="preserve">Acceptance criteria</w:t>
+            </w:r>
+          </w:p>
+        </w:tc>
+      </w:tr>
+      <w:tr>
+        <w:tc>
+          <w:tcPr>
+            <w:tcW w:type="auto" w:w="100"/>
+            <w:tcBorders>
+              <w:top w:val="single" w:color="D9D5CD" w:sz="2"/>
+              <w:left w:val="single" w:color="D9D5CD" w:sz="2"/>
+              <w:bottom w:val="single" w:color="D9D5CD" w:sz="2"/>
+              <w:right w:val="single" w:color="D9D5CD" w:sz="2"/>
+            </w:tcBorders>
+            <w:tcMar>
+              <w:top w:type="dxa" w:w="60"/>
+              <w:left w:type="dxa" w:w="90"/>
+              <w:bottom w:type="dxa" w:w="60"/>
+              <w:right w:type="dxa" w:w="90"/>
+            </w:tcMar>
+          </w:tcPr>
+          <w:p>
+            <w:pPr>
+              <w:spacing w:after="0"/>
+            </w:pPr>
+            <w:r>
+              <w:rPr>
+                <w:color w:val="0D1B2A"/>
+              </w:rPr>
+              <w:t xml:space="preserve">FR-FG-040</w:t>
+            </w:r>
+          </w:p>
+        </w:tc>
+        <w:tc>
+          <w:tcPr>
+            <w:tcW w:type="auto" w:w="100"/>
+            <w:tcBorders>
+              <w:top w:val="single" w:color="D9D5CD" w:sz="2"/>
+              <w:left w:val="single" w:color="D9D5CD" w:sz="2"/>
+              <w:bottom w:val="single" w:color="D9D5CD" w:sz="2"/>
+              <w:right w:val="single" w:color="D9D5CD" w:sz="2"/>
+            </w:tcBorders>
+            <w:tcMar>
+              <w:top w:type="dxa" w:w="60"/>
+              <w:left w:type="dxa" w:w="90"/>
+              <w:bottom w:type="dxa" w:w="60"/>
+              <w:right w:type="dxa" w:w="90"/>
+            </w:tcMar>
+          </w:tcPr>
+          <w:p>
+            <w:pPr>
+              <w:spacing w:after="0"/>
+            </w:pPr>
+            <w:r>
+              <w:rPr>
+                <w:color w:val="0D1B2A"/>
+              </w:rPr>
+              <w:t xml:space="preserve">M</w:t>
+            </w:r>
+          </w:p>
+        </w:tc>
+        <w:tc>
+          <w:tcPr>
+            <w:tcW w:type="auto" w:w="100"/>
+            <w:tcBorders>
+              <w:top w:val="single" w:color="D9D5CD" w:sz="2"/>
+              <w:left w:val="single" w:color="D9D5CD" w:sz="2"/>
+              <w:bottom w:val="single" w:color="D9D5CD" w:sz="2"/>
+              <w:right w:val="single" w:color="D9D5CD" w:sz="2"/>
+            </w:tcBorders>
+            <w:tcMar>
+              <w:top w:type="dxa" w:w="60"/>
+              <w:left w:type="dxa" w:w="90"/>
+              <w:bottom w:type="dxa" w:w="60"/>
+              <w:right w:type="dxa" w:w="90"/>
+            </w:tcMar>
+          </w:tcPr>
+          <w:p>
+            <w:pPr>
+              <w:spacing w:after="0"/>
+            </w:pPr>
+            <w:r>
+              <w:rPr>
+                <w:color w:val="0D1B2A"/>
+              </w:rPr>
+              <w:t xml:space="preserve">The audit trail SHALL record, for every BDM/PDM change, the </w:t>
+            </w:r>
+            <w:r>
+              <w:rPr>
+                <w:b/>
+                <w:bCs/>
+                <w:color w:val="0D1B2A"/>
+              </w:rPr>
+              <w:t xml:space="preserve">domain proposer, domain approver(s), and CDA sign-off</w:t>
+            </w:r>
+            <w:r>
+              <w:rPr>
+                <w:color w:val="0D1B2A"/>
+              </w:rPr>
+              <w:t xml:space="preserve"> (where applicable).</w:t>
+            </w:r>
+          </w:p>
+        </w:tc>
+        <w:tc>
+          <w:tcPr>
+            <w:tcW w:type="auto" w:w="100"/>
+            <w:tcBorders>
+              <w:top w:val="single" w:color="D9D5CD" w:sz="2"/>
+              <w:left w:val="single" w:color="D9D5CD" w:sz="2"/>
+              <w:bottom w:val="single" w:color="D9D5CD" w:sz="2"/>
+              <w:right w:val="single" w:color="D9D5CD" w:sz="2"/>
+            </w:tcBorders>
+            <w:tcMar>
+              <w:top w:type="dxa" w:w="60"/>
+              <w:left w:type="dxa" w:w="90"/>
+              <w:bottom w:type="dxa" w:w="60"/>
+              <w:right w:type="dxa" w:w="90"/>
+            </w:tcMar>
+          </w:tcPr>
+          <w:p>
+            <w:pPr>
+              <w:spacing w:after="0"/>
+            </w:pPr>
+            <w:r>
+              <w:rPr>
+                <w:color w:val="0D1B2A"/>
+              </w:rPr>
+              <w:t xml:space="preserve">The audit/evidence bundle shows both tiers for a governed change.</w:t>
+            </w:r>
+          </w:p>
+        </w:tc>
+      </w:tr>
+      <w:tr>
+        <w:tc>
+          <w:tcPr>
+            <w:tcW w:type="auto" w:w="100"/>
+            <w:tcBorders>
+              <w:top w:val="single" w:color="D9D5CD" w:sz="2"/>
+              <w:left w:val="single" w:color="D9D5CD" w:sz="2"/>
+              <w:bottom w:val="single" w:color="D9D5CD" w:sz="2"/>
+              <w:right w:val="single" w:color="D9D5CD" w:sz="2"/>
+            </w:tcBorders>
+            <w:shd w:color="F1EFE9" w:val="solid"/>
+            <w:tcMar>
+              <w:top w:type="dxa" w:w="60"/>
+              <w:left w:type="dxa" w:w="90"/>
+              <w:bottom w:type="dxa" w:w="60"/>
+              <w:right w:type="dxa" w:w="90"/>
+            </w:tcMar>
+          </w:tcPr>
+          <w:p>
+            <w:pPr>
+              <w:spacing w:after="0"/>
+            </w:pPr>
+            <w:r>
+              <w:rPr>
+                <w:color w:val="0D1B2A"/>
+              </w:rPr>
+              <w:t xml:space="preserve">FR-FG-041</w:t>
+            </w:r>
+          </w:p>
+        </w:tc>
+        <w:tc>
+          <w:tcPr>
+            <w:tcW w:type="auto" w:w="100"/>
+            <w:tcBorders>
+              <w:top w:val="single" w:color="D9D5CD" w:sz="2"/>
+              <w:left w:val="single" w:color="D9D5CD" w:sz="2"/>
+              <w:bottom w:val="single" w:color="D9D5CD" w:sz="2"/>
+              <w:right w:val="single" w:color="D9D5CD" w:sz="2"/>
+            </w:tcBorders>
+            <w:shd w:color="F1EFE9" w:val="solid"/>
+            <w:tcMar>
+              <w:top w:type="dxa" w:w="60"/>
+              <w:left w:type="dxa" w:w="90"/>
+              <w:bottom w:type="dxa" w:w="60"/>
+              <w:right w:type="dxa" w:w="90"/>
+            </w:tcMar>
+          </w:tcPr>
+          <w:p>
+            <w:pPr>
+              <w:spacing w:after="0"/>
+            </w:pPr>
+            <w:r>
+              <w:rPr>
+                <w:color w:val="0D1B2A"/>
+              </w:rPr>
+              <w:t xml:space="preserve">S</w:t>
+            </w:r>
+          </w:p>
+        </w:tc>
+        <w:tc>
+          <w:tcPr>
+            <w:tcW w:type="auto" w:w="100"/>
+            <w:tcBorders>
+              <w:top w:val="single" w:color="D9D5CD" w:sz="2"/>
+              <w:left w:val="single" w:color="D9D5CD" w:sz="2"/>
+              <w:bottom w:val="single" w:color="D9D5CD" w:sz="2"/>
+              <w:right w:val="single" w:color="D9D5CD" w:sz="2"/>
+            </w:tcBorders>
+            <w:shd w:color="F1EFE9" w:val="solid"/>
+            <w:tcMar>
+              <w:top w:type="dxa" w:w="60"/>
+              <w:left w:type="dxa" w:w="90"/>
+              <w:bottom w:type="dxa" w:w="60"/>
+              <w:right w:type="dxa" w:w="90"/>
+            </w:tcMar>
+          </w:tcPr>
+          <w:p>
+            <w:pPr>
+              <w:spacing w:after="0"/>
+            </w:pPr>
+            <w:r>
+              <w:rPr>
+                <w:color w:val="0D1B2A"/>
+              </w:rPr>
+              <w:t xml:space="preserve">The system SHALL produce a </w:t>
+            </w:r>
+            <w:r>
+              <w:rPr>
+                <w:b/>
+                <w:bCs/>
+                <w:color w:val="0D1B2A"/>
+              </w:rPr>
+              <w:t xml:space="preserve">per-change evidence bundle</w:t>
+            </w:r>
+            <w:r>
+              <w:rPr>
+                <w:color w:val="0D1B2A"/>
+              </w:rPr>
+              <w:t xml:space="preserve"> evidencing the federated approval chain.</w:t>
+            </w:r>
+          </w:p>
+        </w:tc>
+        <w:tc>
+          <w:tcPr>
+            <w:tcW w:type="auto" w:w="100"/>
+            <w:tcBorders>
+              <w:top w:val="single" w:color="D9D5CD" w:sz="2"/>
+              <w:left w:val="single" w:color="D9D5CD" w:sz="2"/>
+              <w:bottom w:val="single" w:color="D9D5CD" w:sz="2"/>
+              <w:right w:val="single" w:color="D9D5CD" w:sz="2"/>
+            </w:tcBorders>
+            <w:shd w:color="F1EFE9" w:val="solid"/>
+            <w:tcMar>
+              <w:top w:type="dxa" w:w="60"/>
+              <w:left w:type="dxa" w:w="90"/>
+              <w:bottom w:type="dxa" w:w="60"/>
+              <w:right w:type="dxa" w:w="90"/>
+            </w:tcMar>
+          </w:tcPr>
+          <w:p>
+            <w:pPr>
+              <w:spacing w:after="0"/>
+            </w:pPr>
+            <w:r>
+              <w:rPr>
+                <w:color w:val="0D1B2A"/>
+              </w:rPr>
+              <w:t xml:space="preserve">An evidence bundle exports showing the full approval chain.</w:t>
+            </w:r>
+          </w:p>
+        </w:tc>
+      </w:tr>
+    </w:tbl>
+    <w:p>
+      <w:pPr>
+        <w:spacing w:after="120"/>
+      </w:pPr>
+    </w:p>
+    <w:p>
+      <w:pPr>
+        <w:pStyle w:val="Heading1"/>
+        <w:pageBreakBefore/>
+        <w:spacing w:after="120"/>
+      </w:pPr>
+      <w:r>
+        <w:rPr>
+          <w:b/>
+          <w:bCs/>
+          <w:color w:val="0D1B2A"/>
+        </w:rPr>
         <w:t xml:space="preserve">6. Traceability Matrix</w:t>
       </w:r>
     </w:p>
@@ -28332,6 +32258,64 @@
           </w:p>
         </w:tc>
       </w:tr>
+      <w:tr>
+        <w:tc>
+          <w:tcPr>
+            <w:tcW w:type="auto" w:w="100"/>
+            <w:tcBorders>
+              <w:top w:val="single" w:color="D9D5CD" w:sz="2"/>
+              <w:left w:val="single" w:color="D9D5CD" w:sz="2"/>
+              <w:bottom w:val="single" w:color="D9D5CD" w:sz="2"/>
+              <w:right w:val="single" w:color="D9D5CD" w:sz="2"/>
+            </w:tcBorders>
+            <w:tcMar>
+              <w:top w:type="dxa" w:w="60"/>
+              <w:left w:type="dxa" w:w="90"/>
+              <w:bottom w:type="dxa" w:w="60"/>
+              <w:right w:type="dxa" w:w="90"/>
+            </w:tcMar>
+          </w:tcPr>
+          <w:p>
+            <w:pPr>
+              <w:spacing w:after="0"/>
+            </w:pPr>
+            <w:r>
+              <w:rPr>
+                <w:color w:val="0D1B2A"/>
+              </w:rPr>
+              <w:t xml:space="preserve">DCT-EP11</w:t>
+            </w:r>
+          </w:p>
+        </w:tc>
+        <w:tc>
+          <w:tcPr>
+            <w:tcW w:type="auto" w:w="100"/>
+            <w:tcBorders>
+              <w:top w:val="single" w:color="D9D5CD" w:sz="2"/>
+              <w:left w:val="single" w:color="D9D5CD" w:sz="2"/>
+              <w:bottom w:val="single" w:color="D9D5CD" w:sz="2"/>
+              <w:right w:val="single" w:color="D9D5CD" w:sz="2"/>
+            </w:tcBorders>
+            <w:tcMar>
+              <w:top w:type="dxa" w:w="60"/>
+              <w:left w:type="dxa" w:w="90"/>
+              <w:bottom w:type="dxa" w:w="60"/>
+              <w:right w:type="dxa" w:w="90"/>
+            </w:tcMar>
+          </w:tcPr>
+          <w:p>
+            <w:pPr>
+              <w:spacing w:after="0"/>
+            </w:pPr>
+            <w:r>
+              <w:rPr>
+                <w:color w:val="0D1B2A"/>
+              </w:rPr>
+              <w:t xml:space="preserve">Federated operating model &amp; enterprise (CDA) sign-off</w:t>
+            </w:r>
+          </w:p>
+        </w:tc>
+      </w:tr>
     </w:tbl>
     <w:p>
       <w:pPr>
@@ -29688,6 +33672,92 @@
                 <w:color w:val="0D1B2A"/>
               </w:rPr>
               <w:t xml:space="preserve">DCT-EP07, DCT-EP10</w:t>
+            </w:r>
+          </w:p>
+        </w:tc>
+      </w:tr>
+      <w:tr>
+        <w:tc>
+          <w:tcPr>
+            <w:tcW w:type="auto" w:w="100"/>
+            <w:tcBorders>
+              <w:top w:val="single" w:color="D9D5CD" w:sz="2"/>
+              <w:left w:val="single" w:color="D9D5CD" w:sz="2"/>
+              <w:bottom w:val="single" w:color="D9D5CD" w:sz="2"/>
+              <w:right w:val="single" w:color="D9D5CD" w:sz="2"/>
+            </w:tcBorders>
+            <w:tcMar>
+              <w:top w:type="dxa" w:w="60"/>
+              <w:left w:type="dxa" w:w="90"/>
+              <w:bottom w:type="dxa" w:w="60"/>
+              <w:right w:type="dxa" w:w="90"/>
+            </w:tcMar>
+          </w:tcPr>
+          <w:p>
+            <w:pPr>
+              <w:spacing w:after="0"/>
+            </w:pPr>
+            <w:r>
+              <w:rPr>
+                <w:color w:val="0D1B2A"/>
+              </w:rPr>
+              <w:t xml:space="preserve">FR-FG Federated governance (domain ownership, CDA sign-off, routing)</w:t>
+            </w:r>
+          </w:p>
+        </w:tc>
+        <w:tc>
+          <w:tcPr>
+            <w:tcW w:type="auto" w:w="100"/>
+            <w:tcBorders>
+              <w:top w:val="single" w:color="D9D5CD" w:sz="2"/>
+              <w:left w:val="single" w:color="D9D5CD" w:sz="2"/>
+              <w:bottom w:val="single" w:color="D9D5CD" w:sz="2"/>
+              <w:right w:val="single" w:color="D9D5CD" w:sz="2"/>
+            </w:tcBorders>
+            <w:tcMar>
+              <w:top w:type="dxa" w:w="60"/>
+              <w:left w:type="dxa" w:w="90"/>
+              <w:bottom w:type="dxa" w:w="60"/>
+              <w:right w:type="dxa" w:w="90"/>
+            </w:tcMar>
+          </w:tcPr>
+          <w:p>
+            <w:pPr>
+              <w:spacing w:after="0"/>
+            </w:pPr>
+            <w:r>
+              <w:rPr>
+                <w:color w:val="0D1B2A"/>
+              </w:rPr>
+              <w:t xml:space="preserve">P3–P4</w:t>
+            </w:r>
+          </w:p>
+        </w:tc>
+        <w:tc>
+          <w:tcPr>
+            <w:tcW w:type="auto" w:w="100"/>
+            <w:tcBorders>
+              <w:top w:val="single" w:color="D9D5CD" w:sz="2"/>
+              <w:left w:val="single" w:color="D9D5CD" w:sz="2"/>
+              <w:bottom w:val="single" w:color="D9D5CD" w:sz="2"/>
+              <w:right w:val="single" w:color="D9D5CD" w:sz="2"/>
+            </w:tcBorders>
+            <w:tcMar>
+              <w:top w:type="dxa" w:w="60"/>
+              <w:left w:type="dxa" w:w="90"/>
+              <w:bottom w:type="dxa" w:w="60"/>
+              <w:right w:type="dxa" w:w="90"/>
+            </w:tcMar>
+          </w:tcPr>
+          <w:p>
+            <w:pPr>
+              <w:spacing w:after="0"/>
+            </w:pPr>
+            <w:r>
+              <w:rPr>
+                <w:color w:val="0D1B2A"/>
+              </w:rPr>
+              <w:t xml:space="preserve">DCT-EP11 (with DCT-EP04, DCT-EP05)</w:t>
             </w:r>
           </w:p>
         </w:tc>

</xml_diff>